<commit_message>
Something changed in CIS
</commit_message>
<xml_diff>
--- a/Отчёты/БД/5Лаб.docx
+++ b/Отчёты/БД/5Лаб.docx
@@ -1,6 +1,6 @@
 
 <file path=word/document.xml><?xml version="1.0" encoding="utf-8"?>
-<w:document xmlns:ve="http://schemas.openxmlformats.org/markup-compatibility/2006" xmlns:o="urn:schemas-microsoft-com:office:office" xmlns:r="http://schemas.openxmlformats.org/officeDocument/2006/relationships" xmlns:m="http://schemas.openxmlformats.org/officeDocument/2006/math" xmlns:v="urn:schemas-microsoft-com:vml" xmlns:wp="http://schemas.openxmlformats.org/drawingml/2006/wordprocessingDrawing" xmlns:w10="urn:schemas-microsoft-com:office:word" xmlns:w="http://schemas.openxmlformats.org/wordprocessingml/2006/main" xmlns:wne="http://schemas.microsoft.com/office/word/2006/wordml">
+<w:document xmlns:wpc="http://schemas.microsoft.com/office/word/2010/wordprocessingCanvas" xmlns:cx="http://schemas.microsoft.com/office/drawing/2014/chartex" xmlns:cx1="http://schemas.microsoft.com/office/drawing/2015/9/8/chartex" xmlns:cx2="http://schemas.microsoft.com/office/drawing/2015/10/21/chartex" xmlns:cx3="http://schemas.microsoft.com/office/drawing/2016/5/9/chartex" xmlns:cx4="http://schemas.microsoft.com/office/drawing/2016/5/10/chartex" xmlns:cx5="http://schemas.microsoft.com/office/drawing/2016/5/11/chartex" xmlns:cx6="http://schemas.microsoft.com/office/drawing/2016/5/12/chartex" xmlns:cx7="http://schemas.microsoft.com/office/drawing/2016/5/13/chartex" xmlns:cx8="http://schemas.microsoft.com/office/drawing/2016/5/14/chartex" xmlns:mc="http://schemas.openxmlformats.org/markup-compatibility/2006" xmlns:aink="http://schemas.microsoft.com/office/drawing/2016/ink" xmlns:am3d="http://schemas.microsoft.com/office/drawing/2017/model3d" xmlns:o="urn:schemas-microsoft-com:office:office" xmlns:r="http://schemas.openxmlformats.org/officeDocument/2006/relationships" xmlns:m="http://schemas.openxmlformats.org/officeDocument/2006/math" xmlns:v="urn:schemas-microsoft-com:vml" xmlns:wp14="http://schemas.microsoft.com/office/word/2010/wordprocessingDrawing" xmlns:wp="http://schemas.openxmlformats.org/drawingml/2006/wordprocessingDrawing" xmlns:w10="urn:schemas-microsoft-com:office:word" xmlns:w="http://schemas.openxmlformats.org/wordprocessingml/2006/main" xmlns:w14="http://schemas.microsoft.com/office/word/2010/wordml" xmlns:w15="http://schemas.microsoft.com/office/word/2012/wordml" xmlns:w16cex="http://schemas.microsoft.com/office/word/2018/wordml/cex" xmlns:w16cid="http://schemas.microsoft.com/office/word/2016/wordml/cid" xmlns:w16="http://schemas.microsoft.com/office/word/2018/wordml" xmlns:w16sdtdh="http://schemas.microsoft.com/office/word/2020/wordml/sdtdatahash" xmlns:w16se="http://schemas.microsoft.com/office/word/2015/wordml/symex" xmlns:wpg="http://schemas.microsoft.com/office/word/2010/wordprocessingGroup" xmlns:wpi="http://schemas.microsoft.com/office/word/2010/wordprocessingInk" xmlns:wne="http://schemas.microsoft.com/office/word/2006/wordml" xmlns:wps="http://schemas.microsoft.com/office/word/2010/wordprocessingShape" mc:Ignorable="w14 w15 w16se w16cid w16 w16cex w16sdtdh wp14">
   <w:body>
     <w:p>
       <w:pPr>
@@ -342,7 +342,7 @@
           <w:noProof/>
         </w:rPr>
         <w:drawing>
-          <wp:inline distT="0" distB="0" distL="0" distR="0">
+          <wp:inline distT="0" distB="0" distL="0" distR="0" wp14:anchorId="735E5284" wp14:editId="0490807A">
             <wp:extent cx="5934710" cy="1380490"/>
             <wp:effectExtent l="19050" t="0" r="8890" b="0"/>
             <wp:docPr id="9" name="Рисунок 1"/>
@@ -400,7 +400,7 @@
           <w:noProof/>
         </w:rPr>
         <w:drawing>
-          <wp:inline distT="0" distB="0" distL="0" distR="0">
+          <wp:inline distT="0" distB="0" distL="0" distR="0" wp14:anchorId="369D78CD" wp14:editId="523017F4">
             <wp:extent cx="5934710" cy="1656080"/>
             <wp:effectExtent l="19050" t="0" r="8890" b="0"/>
             <wp:docPr id="13" name="Рисунок 2"/>
@@ -458,7 +458,7 @@
           <w:noProof/>
         </w:rPr>
         <w:drawing>
-          <wp:inline distT="0" distB="0" distL="0" distR="0">
+          <wp:inline distT="0" distB="0" distL="0" distR="0" wp14:anchorId="1A13D06C" wp14:editId="052F7E7A">
             <wp:extent cx="5934075" cy="1390650"/>
             <wp:effectExtent l="19050" t="0" r="9525" b="0"/>
             <wp:docPr id="25" name="Рисунок 3"/>
@@ -516,7 +516,7 @@
           <w:noProof/>
         </w:rPr>
         <w:drawing>
-          <wp:inline distT="0" distB="0" distL="0" distR="0">
+          <wp:inline distT="0" distB="0" distL="0" distR="0" wp14:anchorId="0A13CD7D" wp14:editId="34BEEC9B">
             <wp:extent cx="5934710" cy="1405890"/>
             <wp:effectExtent l="19050" t="0" r="8890" b="0"/>
             <wp:docPr id="26" name="Рисунок 4"/>
@@ -574,10 +574,10 @@
           <w:noProof/>
         </w:rPr>
         <w:drawing>
-          <wp:inline distT="0" distB="0" distL="0" distR="0">
-            <wp:extent cx="5934710" cy="655320"/>
-            <wp:effectExtent l="19050" t="0" r="8890" b="0"/>
-            <wp:docPr id="27" name="Рисунок 5"/>
+          <wp:inline distT="0" distB="0" distL="0" distR="0" wp14:anchorId="39FDBFD1" wp14:editId="1F643220">
+            <wp:extent cx="5940425" cy="1473835"/>
+            <wp:effectExtent l="0" t="0" r="0" b="0"/>
+            <wp:docPr id="1" name="Рисунок 1"/>
             <wp:cNvGraphicFramePr>
               <a:graphicFrameLocks xmlns:a="http://schemas.openxmlformats.org/drawingml/2006/main" noChangeAspect="1"/>
             </wp:cNvGraphicFramePr>
@@ -585,33 +585,23 @@
               <a:graphicData uri="http://schemas.openxmlformats.org/drawingml/2006/picture">
                 <pic:pic xmlns:pic="http://schemas.openxmlformats.org/drawingml/2006/picture">
                   <pic:nvPicPr>
-                    <pic:cNvPr id="0" name="Picture 5"/>
-                    <pic:cNvPicPr>
-                      <a:picLocks noChangeAspect="1" noChangeArrowheads="1"/>
-                    </pic:cNvPicPr>
+                    <pic:cNvPr id="1" name=""/>
+                    <pic:cNvPicPr/>
                   </pic:nvPicPr>
                   <pic:blipFill>
                     <a:blip r:embed="rId12"/>
-                    <a:srcRect/>
                     <a:stretch>
                       <a:fillRect/>
                     </a:stretch>
                   </pic:blipFill>
-                  <pic:spPr bwMode="auto">
+                  <pic:spPr>
                     <a:xfrm>
                       <a:off x="0" y="0"/>
-                      <a:ext cx="5934710" cy="655320"/>
+                      <a:ext cx="5940425" cy="1473835"/>
                     </a:xfrm>
                     <a:prstGeom prst="rect">
                       <a:avLst/>
                     </a:prstGeom>
-                    <a:noFill/>
-                    <a:ln w="9525">
-                      <a:noFill/>
-                      <a:miter lim="800000"/>
-                      <a:headEnd/>
-                      <a:tailEnd/>
-                    </a:ln>
                   </pic:spPr>
                 </pic:pic>
               </a:graphicData>
@@ -623,17 +613,201 @@
     <w:p>
       <w:pPr>
         <w:pStyle w:val="afd"/>
-      </w:pPr>
-      <w:r>
-        <w:t>В запросах 5-7 тех, кто не сдавал экзамен, попросту нет (!)</w:t>
-      </w:r>
-      <w:r>
-        <w:br/>
-        <w:t>Следовательно, предыдущий запрос не правильный :Р</w:t>
+        <w:rPr>
+          <w:lang w:val="en-US"/>
+        </w:rPr>
+      </w:pPr>
+      <w:r>
+        <w:rPr>
+          <w:noProof/>
+        </w:rPr>
+        <w:lastRenderedPageBreak/>
+        <w:drawing>
+          <wp:inline distT="0" distB="0" distL="0" distR="0" wp14:anchorId="6DB604F1" wp14:editId="29829B8E">
+            <wp:extent cx="5940425" cy="850900"/>
+            <wp:effectExtent l="0" t="0" r="0" b="0"/>
+            <wp:docPr id="2" name="Рисунок 2"/>
+            <wp:cNvGraphicFramePr>
+              <a:graphicFrameLocks xmlns:a="http://schemas.openxmlformats.org/drawingml/2006/main" noChangeAspect="1"/>
+            </wp:cNvGraphicFramePr>
+            <a:graphic xmlns:a="http://schemas.openxmlformats.org/drawingml/2006/main">
+              <a:graphicData uri="http://schemas.openxmlformats.org/drawingml/2006/picture">
+                <pic:pic xmlns:pic="http://schemas.openxmlformats.org/drawingml/2006/picture">
+                  <pic:nvPicPr>
+                    <pic:cNvPr id="1" name=""/>
+                    <pic:cNvPicPr/>
+                  </pic:nvPicPr>
+                  <pic:blipFill>
+                    <a:blip r:embed="rId13"/>
+                    <a:stretch>
+                      <a:fillRect/>
+                    </a:stretch>
+                  </pic:blipFill>
+                  <pic:spPr>
+                    <a:xfrm>
+                      <a:off x="0" y="0"/>
+                      <a:ext cx="5940425" cy="850900"/>
+                    </a:xfrm>
+                    <a:prstGeom prst="rect">
+                      <a:avLst/>
+                    </a:prstGeom>
+                  </pic:spPr>
+                </pic:pic>
+              </a:graphicData>
+            </a:graphic>
+          </wp:inline>
+        </w:drawing>
+      </w:r>
+    </w:p>
+    <w:p>
+      <w:pPr>
+        <w:pStyle w:val="afd"/>
+        <w:pBdr>
+          <w:bottom w:val="single" w:sz="6" w:space="1" w:color="auto"/>
+        </w:pBdr>
+        <w:rPr>
+          <w:lang w:val="en-US"/>
+        </w:rPr>
+      </w:pPr>
+      <w:r>
+        <w:rPr>
+          <w:noProof/>
+        </w:rPr>
+        <w:drawing>
+          <wp:inline distT="0" distB="0" distL="0" distR="0" wp14:anchorId="6147B611" wp14:editId="7CCCE9C6">
+            <wp:extent cx="5940425" cy="1328420"/>
+            <wp:effectExtent l="0" t="0" r="0" b="0"/>
+            <wp:docPr id="3" name="Рисунок 3"/>
+            <wp:cNvGraphicFramePr>
+              <a:graphicFrameLocks xmlns:a="http://schemas.openxmlformats.org/drawingml/2006/main" noChangeAspect="1"/>
+            </wp:cNvGraphicFramePr>
+            <a:graphic xmlns:a="http://schemas.openxmlformats.org/drawingml/2006/main">
+              <a:graphicData uri="http://schemas.openxmlformats.org/drawingml/2006/picture">
+                <pic:pic xmlns:pic="http://schemas.openxmlformats.org/drawingml/2006/picture">
+                  <pic:nvPicPr>
+                    <pic:cNvPr id="1" name=""/>
+                    <pic:cNvPicPr/>
+                  </pic:nvPicPr>
+                  <pic:blipFill>
+                    <a:blip r:embed="rId14"/>
+                    <a:stretch>
+                      <a:fillRect/>
+                    </a:stretch>
+                  </pic:blipFill>
+                  <pic:spPr>
+                    <a:xfrm>
+                      <a:off x="0" y="0"/>
+                      <a:ext cx="5940425" cy="1328420"/>
+                    </a:xfrm>
+                    <a:prstGeom prst="rect">
+                      <a:avLst/>
+                    </a:prstGeom>
+                  </pic:spPr>
+                </pic:pic>
+              </a:graphicData>
+            </a:graphic>
+          </wp:inline>
+        </w:drawing>
+      </w:r>
+    </w:p>
+    <w:p>
+      <w:pPr>
+        <w:pStyle w:val="afd"/>
+        <w:rPr>
+          <w:lang w:val="en-US"/>
+        </w:rPr>
+      </w:pPr>
+      <w:r>
+        <w:rPr>
+          <w:noProof/>
+        </w:rPr>
+        <w:drawing>
+          <wp:inline distT="0" distB="0" distL="0" distR="0" wp14:anchorId="7F192E1F" wp14:editId="442A804C">
+            <wp:extent cx="5940425" cy="1527810"/>
+            <wp:effectExtent l="0" t="0" r="0" b="0"/>
+            <wp:docPr id="4" name="Рисунок 4"/>
+            <wp:cNvGraphicFramePr>
+              <a:graphicFrameLocks xmlns:a="http://schemas.openxmlformats.org/drawingml/2006/main" noChangeAspect="1"/>
+            </wp:cNvGraphicFramePr>
+            <a:graphic xmlns:a="http://schemas.openxmlformats.org/drawingml/2006/main">
+              <a:graphicData uri="http://schemas.openxmlformats.org/drawingml/2006/picture">
+                <pic:pic xmlns:pic="http://schemas.openxmlformats.org/drawingml/2006/picture">
+                  <pic:nvPicPr>
+                    <pic:cNvPr id="1" name=""/>
+                    <pic:cNvPicPr/>
+                  </pic:nvPicPr>
+                  <pic:blipFill>
+                    <a:blip r:embed="rId15"/>
+                    <a:stretch>
+                      <a:fillRect/>
+                    </a:stretch>
+                  </pic:blipFill>
+                  <pic:spPr>
+                    <a:xfrm>
+                      <a:off x="0" y="0"/>
+                      <a:ext cx="5940425" cy="1527810"/>
+                    </a:xfrm>
+                    <a:prstGeom prst="rect">
+                      <a:avLst/>
+                    </a:prstGeom>
+                  </pic:spPr>
+                </pic:pic>
+              </a:graphicData>
+            </a:graphic>
+          </wp:inline>
+        </w:drawing>
+      </w:r>
+    </w:p>
+    <w:p>
+      <w:pPr>
+        <w:pStyle w:val="afd"/>
+        <w:rPr>
+          <w:lang w:val="en-US"/>
+        </w:rPr>
+      </w:pPr>
+      <w:r>
+        <w:rPr>
+          <w:noProof/>
+        </w:rPr>
+        <w:drawing>
+          <wp:inline distT="0" distB="0" distL="0" distR="0" wp14:anchorId="32E9B372" wp14:editId="59919636">
+            <wp:extent cx="5940425" cy="1311910"/>
+            <wp:effectExtent l="0" t="0" r="0" b="0"/>
+            <wp:docPr id="6" name="Рисунок 6"/>
+            <wp:cNvGraphicFramePr>
+              <a:graphicFrameLocks xmlns:a="http://schemas.openxmlformats.org/drawingml/2006/main" noChangeAspect="1"/>
+            </wp:cNvGraphicFramePr>
+            <a:graphic xmlns:a="http://schemas.openxmlformats.org/drawingml/2006/main">
+              <a:graphicData uri="http://schemas.openxmlformats.org/drawingml/2006/picture">
+                <pic:pic xmlns:pic="http://schemas.openxmlformats.org/drawingml/2006/picture">
+                  <pic:nvPicPr>
+                    <pic:cNvPr id="1" name=""/>
+                    <pic:cNvPicPr/>
+                  </pic:nvPicPr>
+                  <pic:blipFill>
+                    <a:blip r:embed="rId16"/>
+                    <a:stretch>
+                      <a:fillRect/>
+                    </a:stretch>
+                  </pic:blipFill>
+                  <pic:spPr>
+                    <a:xfrm>
+                      <a:off x="0" y="0"/>
+                      <a:ext cx="5940425" cy="1311910"/>
+                    </a:xfrm>
+                    <a:prstGeom prst="rect">
+                      <a:avLst/>
+                    </a:prstGeom>
+                  </pic:spPr>
+                </pic:pic>
+              </a:graphicData>
+            </a:graphic>
+          </wp:inline>
+        </w:drawing>
       </w:r>
     </w:p>
     <w:sectPr>
-      <w:footerReference w:type="default" r:id="rId13"/>
+      <w:footerReference w:type="default" r:id="rId17"/>
       <w:pgSz w:w="11906" w:h="16838"/>
       <w:pgMar w:top="1134" w:right="850" w:bottom="1134" w:left="1701" w:header="708" w:footer="708" w:gutter="0"/>
       <w:cols w:space="708"/>
@@ -645,8 +819,8 @@
 </file>
 
 <file path=word/endnotes.xml><?xml version="1.0" encoding="utf-8"?>
-<w:endnotes xmlns:ve="http://schemas.openxmlformats.org/markup-compatibility/2006" xmlns:o="urn:schemas-microsoft-com:office:office" xmlns:r="http://schemas.openxmlformats.org/officeDocument/2006/relationships" xmlns:m="http://schemas.openxmlformats.org/officeDocument/2006/math" xmlns:v="urn:schemas-microsoft-com:vml" xmlns:wp="http://schemas.openxmlformats.org/drawingml/2006/wordprocessingDrawing" xmlns:w10="urn:schemas-microsoft-com:office:word" xmlns:w="http://schemas.openxmlformats.org/wordprocessingml/2006/main" xmlns:wne="http://schemas.microsoft.com/office/word/2006/wordml">
-  <w:endnote w:type="separator" w:id="0">
+<w:endnotes xmlns:wpc="http://schemas.microsoft.com/office/word/2010/wordprocessingCanvas" xmlns:cx="http://schemas.microsoft.com/office/drawing/2014/chartex" xmlns:cx1="http://schemas.microsoft.com/office/drawing/2015/9/8/chartex" xmlns:cx2="http://schemas.microsoft.com/office/drawing/2015/10/21/chartex" xmlns:cx3="http://schemas.microsoft.com/office/drawing/2016/5/9/chartex" xmlns:cx4="http://schemas.microsoft.com/office/drawing/2016/5/10/chartex" xmlns:cx5="http://schemas.microsoft.com/office/drawing/2016/5/11/chartex" xmlns:cx6="http://schemas.microsoft.com/office/drawing/2016/5/12/chartex" xmlns:cx7="http://schemas.microsoft.com/office/drawing/2016/5/13/chartex" xmlns:cx8="http://schemas.microsoft.com/office/drawing/2016/5/14/chartex" xmlns:mc="http://schemas.openxmlformats.org/markup-compatibility/2006" xmlns:aink="http://schemas.microsoft.com/office/drawing/2016/ink" xmlns:am3d="http://schemas.microsoft.com/office/drawing/2017/model3d" xmlns:o="urn:schemas-microsoft-com:office:office" xmlns:r="http://schemas.openxmlformats.org/officeDocument/2006/relationships" xmlns:m="http://schemas.openxmlformats.org/officeDocument/2006/math" xmlns:v="urn:schemas-microsoft-com:vml" xmlns:wp14="http://schemas.microsoft.com/office/word/2010/wordprocessingDrawing" xmlns:wp="http://schemas.openxmlformats.org/drawingml/2006/wordprocessingDrawing" xmlns:w10="urn:schemas-microsoft-com:office:word" xmlns:w="http://schemas.openxmlformats.org/wordprocessingml/2006/main" xmlns:w14="http://schemas.microsoft.com/office/word/2010/wordml" xmlns:w15="http://schemas.microsoft.com/office/word/2012/wordml" xmlns:w16cex="http://schemas.microsoft.com/office/word/2018/wordml/cex" xmlns:w16cid="http://schemas.microsoft.com/office/word/2016/wordml/cid" xmlns:w16="http://schemas.microsoft.com/office/word/2018/wordml" xmlns:w16sdtdh="http://schemas.microsoft.com/office/word/2020/wordml/sdtdatahash" xmlns:w16se="http://schemas.microsoft.com/office/word/2015/wordml/symex" xmlns:wpg="http://schemas.microsoft.com/office/word/2010/wordprocessingGroup" xmlns:wpi="http://schemas.microsoft.com/office/word/2010/wordprocessingInk" xmlns:wne="http://schemas.microsoft.com/office/word/2006/wordml" xmlns:wps="http://schemas.microsoft.com/office/word/2010/wordprocessingShape" mc:Ignorable="w14 w15 w16se w16cid w16 w16cex w16sdtdh wp14">
+  <w:endnote w:type="separator" w:id="-1">
     <w:p>
       <w:pPr>
         <w:spacing w:line="240" w:lineRule="auto"/>
@@ -656,7 +830,7 @@
       </w:r>
     </w:p>
   </w:endnote>
-  <w:endnote w:type="continuationSeparator" w:id="1">
+  <w:endnote w:type="continuationSeparator" w:id="0">
     <w:p>
       <w:pPr>
         <w:spacing w:line="240" w:lineRule="auto"/>
@@ -670,7 +844,7 @@
 </file>
 
 <file path=word/footer1.xml><?xml version="1.0" encoding="utf-8"?>
-<w:ftr xmlns:ve="http://schemas.openxmlformats.org/markup-compatibility/2006" xmlns:o="urn:schemas-microsoft-com:office:office" xmlns:r="http://schemas.openxmlformats.org/officeDocument/2006/relationships" xmlns:m="http://schemas.openxmlformats.org/officeDocument/2006/math" xmlns:v="urn:schemas-microsoft-com:vml" xmlns:wp="http://schemas.openxmlformats.org/drawingml/2006/wordprocessingDrawing" xmlns:w10="urn:schemas-microsoft-com:office:word" xmlns:w="http://schemas.openxmlformats.org/wordprocessingml/2006/main" xmlns:wne="http://schemas.microsoft.com/office/word/2006/wordml">
+<w:ftr xmlns:wpc="http://schemas.microsoft.com/office/word/2010/wordprocessingCanvas" xmlns:cx="http://schemas.microsoft.com/office/drawing/2014/chartex" xmlns:cx1="http://schemas.microsoft.com/office/drawing/2015/9/8/chartex" xmlns:cx2="http://schemas.microsoft.com/office/drawing/2015/10/21/chartex" xmlns:cx3="http://schemas.microsoft.com/office/drawing/2016/5/9/chartex" xmlns:cx4="http://schemas.microsoft.com/office/drawing/2016/5/10/chartex" xmlns:cx5="http://schemas.microsoft.com/office/drawing/2016/5/11/chartex" xmlns:cx6="http://schemas.microsoft.com/office/drawing/2016/5/12/chartex" xmlns:cx7="http://schemas.microsoft.com/office/drawing/2016/5/13/chartex" xmlns:cx8="http://schemas.microsoft.com/office/drawing/2016/5/14/chartex" xmlns:mc="http://schemas.openxmlformats.org/markup-compatibility/2006" xmlns:aink="http://schemas.microsoft.com/office/drawing/2016/ink" xmlns:am3d="http://schemas.microsoft.com/office/drawing/2017/model3d" xmlns:o="urn:schemas-microsoft-com:office:office" xmlns:r="http://schemas.openxmlformats.org/officeDocument/2006/relationships" xmlns:m="http://schemas.openxmlformats.org/officeDocument/2006/math" xmlns:v="urn:schemas-microsoft-com:vml" xmlns:wp14="http://schemas.microsoft.com/office/word/2010/wordprocessingDrawing" xmlns:wp="http://schemas.openxmlformats.org/drawingml/2006/wordprocessingDrawing" xmlns:w10="urn:schemas-microsoft-com:office:word" xmlns:w="http://schemas.openxmlformats.org/wordprocessingml/2006/main" xmlns:w14="http://schemas.microsoft.com/office/word/2010/wordml" xmlns:w15="http://schemas.microsoft.com/office/word/2012/wordml" xmlns:w16cex="http://schemas.microsoft.com/office/word/2018/wordml/cex" xmlns:w16cid="http://schemas.microsoft.com/office/word/2016/wordml/cid" xmlns:w16="http://schemas.microsoft.com/office/word/2018/wordml" xmlns:w16sdtdh="http://schemas.microsoft.com/office/word/2020/wordml/sdtdatahash" xmlns:w16se="http://schemas.microsoft.com/office/word/2015/wordml/symex" xmlns:wpg="http://schemas.microsoft.com/office/word/2010/wordprocessingGroup" xmlns:wpi="http://schemas.microsoft.com/office/word/2010/wordprocessingInk" xmlns:wne="http://schemas.microsoft.com/office/word/2006/wordml" xmlns:wps="http://schemas.microsoft.com/office/word/2010/wordprocessingShape" mc:Ignorable="w14 w15 w16se w16cid w16 w16cex w16sdtdh wp14">
   <w:p>
     <w:pPr>
       <w:pStyle w:val="af2"/>
@@ -700,8 +874,8 @@
 </file>
 
 <file path=word/footnotes.xml><?xml version="1.0" encoding="utf-8"?>
-<w:footnotes xmlns:ve="http://schemas.openxmlformats.org/markup-compatibility/2006" xmlns:o="urn:schemas-microsoft-com:office:office" xmlns:r="http://schemas.openxmlformats.org/officeDocument/2006/relationships" xmlns:m="http://schemas.openxmlformats.org/officeDocument/2006/math" xmlns:v="urn:schemas-microsoft-com:vml" xmlns:wp="http://schemas.openxmlformats.org/drawingml/2006/wordprocessingDrawing" xmlns:w10="urn:schemas-microsoft-com:office:word" xmlns:w="http://schemas.openxmlformats.org/wordprocessingml/2006/main" xmlns:wne="http://schemas.microsoft.com/office/word/2006/wordml">
-  <w:footnote w:type="separator" w:id="0">
+<w:footnotes xmlns:wpc="http://schemas.microsoft.com/office/word/2010/wordprocessingCanvas" xmlns:cx="http://schemas.microsoft.com/office/drawing/2014/chartex" xmlns:cx1="http://schemas.microsoft.com/office/drawing/2015/9/8/chartex" xmlns:cx2="http://schemas.microsoft.com/office/drawing/2015/10/21/chartex" xmlns:cx3="http://schemas.microsoft.com/office/drawing/2016/5/9/chartex" xmlns:cx4="http://schemas.microsoft.com/office/drawing/2016/5/10/chartex" xmlns:cx5="http://schemas.microsoft.com/office/drawing/2016/5/11/chartex" xmlns:cx6="http://schemas.microsoft.com/office/drawing/2016/5/12/chartex" xmlns:cx7="http://schemas.microsoft.com/office/drawing/2016/5/13/chartex" xmlns:cx8="http://schemas.microsoft.com/office/drawing/2016/5/14/chartex" xmlns:mc="http://schemas.openxmlformats.org/markup-compatibility/2006" xmlns:aink="http://schemas.microsoft.com/office/drawing/2016/ink" xmlns:am3d="http://schemas.microsoft.com/office/drawing/2017/model3d" xmlns:o="urn:schemas-microsoft-com:office:office" xmlns:r="http://schemas.openxmlformats.org/officeDocument/2006/relationships" xmlns:m="http://schemas.openxmlformats.org/officeDocument/2006/math" xmlns:v="urn:schemas-microsoft-com:vml" xmlns:wp14="http://schemas.microsoft.com/office/word/2010/wordprocessingDrawing" xmlns:wp="http://schemas.openxmlformats.org/drawingml/2006/wordprocessingDrawing" xmlns:w10="urn:schemas-microsoft-com:office:word" xmlns:w="http://schemas.openxmlformats.org/wordprocessingml/2006/main" xmlns:w14="http://schemas.microsoft.com/office/word/2010/wordml" xmlns:w15="http://schemas.microsoft.com/office/word/2012/wordml" xmlns:w16cex="http://schemas.microsoft.com/office/word/2018/wordml/cex" xmlns:w16cid="http://schemas.microsoft.com/office/word/2016/wordml/cid" xmlns:w16="http://schemas.microsoft.com/office/word/2018/wordml" xmlns:w16sdtdh="http://schemas.microsoft.com/office/word/2020/wordml/sdtdatahash" xmlns:w16se="http://schemas.microsoft.com/office/word/2015/wordml/symex" xmlns:wpg="http://schemas.microsoft.com/office/word/2010/wordprocessingGroup" xmlns:wpi="http://schemas.microsoft.com/office/word/2010/wordprocessingInk" xmlns:wne="http://schemas.microsoft.com/office/word/2006/wordml" xmlns:wps="http://schemas.microsoft.com/office/word/2010/wordprocessingShape" mc:Ignorable="w14 w15 w16se w16cid w16 w16cex w16sdtdh wp14">
+  <w:footnote w:type="separator" w:id="-1">
     <w:p>
       <w:pPr>
         <w:spacing w:line="240" w:lineRule="auto"/>
@@ -711,7 +885,7 @@
       </w:r>
     </w:p>
   </w:footnote>
-  <w:footnote w:type="continuationSeparator" w:id="1">
+  <w:footnote w:type="continuationSeparator" w:id="0">
     <w:p>
       <w:pPr>
         <w:spacing w:line="240" w:lineRule="auto"/>
@@ -725,8 +899,8 @@
 </file>
 
 <file path=word/numbering.xml><?xml version="1.0" encoding="utf-8"?>
-<w:numbering xmlns:ve="http://schemas.openxmlformats.org/markup-compatibility/2006" xmlns:o="urn:schemas-microsoft-com:office:office" xmlns:r="http://schemas.openxmlformats.org/officeDocument/2006/relationships" xmlns:m="http://schemas.openxmlformats.org/officeDocument/2006/math" xmlns:v="urn:schemas-microsoft-com:vml" xmlns:wp="http://schemas.openxmlformats.org/drawingml/2006/wordprocessingDrawing" xmlns:w10="urn:schemas-microsoft-com:office:word" xmlns:w="http://schemas.openxmlformats.org/wordprocessingml/2006/main" xmlns:wne="http://schemas.microsoft.com/office/word/2006/wordml">
-  <w:abstractNum w:abstractNumId="0">
+<w:numbering xmlns:wpc="http://schemas.microsoft.com/office/word/2010/wordprocessingCanvas" xmlns:cx="http://schemas.microsoft.com/office/drawing/2014/chartex" xmlns:cx1="http://schemas.microsoft.com/office/drawing/2015/9/8/chartex" xmlns:cx2="http://schemas.microsoft.com/office/drawing/2015/10/21/chartex" xmlns:cx3="http://schemas.microsoft.com/office/drawing/2016/5/9/chartex" xmlns:cx4="http://schemas.microsoft.com/office/drawing/2016/5/10/chartex" xmlns:cx5="http://schemas.microsoft.com/office/drawing/2016/5/11/chartex" xmlns:cx6="http://schemas.microsoft.com/office/drawing/2016/5/12/chartex" xmlns:cx7="http://schemas.microsoft.com/office/drawing/2016/5/13/chartex" xmlns:cx8="http://schemas.microsoft.com/office/drawing/2016/5/14/chartex" xmlns:mc="http://schemas.openxmlformats.org/markup-compatibility/2006" xmlns:aink="http://schemas.microsoft.com/office/drawing/2016/ink" xmlns:am3d="http://schemas.microsoft.com/office/drawing/2017/model3d" xmlns:o="urn:schemas-microsoft-com:office:office" xmlns:r="http://schemas.openxmlformats.org/officeDocument/2006/relationships" xmlns:m="http://schemas.openxmlformats.org/officeDocument/2006/math" xmlns:v="urn:schemas-microsoft-com:vml" xmlns:wp14="http://schemas.microsoft.com/office/word/2010/wordprocessingDrawing" xmlns:wp="http://schemas.openxmlformats.org/drawingml/2006/wordprocessingDrawing" xmlns:w10="urn:schemas-microsoft-com:office:word" xmlns:w="http://schemas.openxmlformats.org/wordprocessingml/2006/main" xmlns:w14="http://schemas.microsoft.com/office/word/2010/wordml" xmlns:w15="http://schemas.microsoft.com/office/word/2012/wordml" xmlns:w16cex="http://schemas.microsoft.com/office/word/2018/wordml/cex" xmlns:w16cid="http://schemas.microsoft.com/office/word/2016/wordml/cid" xmlns:w16="http://schemas.microsoft.com/office/word/2018/wordml" xmlns:w16sdtdh="http://schemas.microsoft.com/office/word/2020/wordml/sdtdatahash" xmlns:w16se="http://schemas.microsoft.com/office/word/2015/wordml/symex" xmlns:wpg="http://schemas.microsoft.com/office/word/2010/wordprocessingGroup" xmlns:wpi="http://schemas.microsoft.com/office/word/2010/wordprocessingInk" xmlns:wne="http://schemas.microsoft.com/office/word/2006/wordml" xmlns:wps="http://schemas.microsoft.com/office/word/2010/wordprocessingShape" mc:Ignorable="w14 w15 w16se w16cid w16 w16cex w16sdtdh wp14">
+  <w:abstractNum w:abstractNumId="0" w15:restartNumberingAfterBreak="0">
     <w:nsid w:val="1A3A658A"/>
     <w:multiLevelType w:val="hybridMultilevel"/>
     <w:tmpl w:val="F606D020"/>
@@ -815,7 +989,7 @@
       </w:pPr>
     </w:lvl>
   </w:abstractNum>
-  <w:abstractNum w:abstractNumId="1">
+  <w:abstractNum w:abstractNumId="1" w15:restartNumberingAfterBreak="0">
     <w:nsid w:val="1AAA1ED4"/>
     <w:multiLevelType w:val="hybridMultilevel"/>
     <w:tmpl w:val="464C5FE2"/>
@@ -905,7 +1079,7 @@
       </w:pPr>
     </w:lvl>
   </w:abstractNum>
-  <w:abstractNum w:abstractNumId="2">
+  <w:abstractNum w:abstractNumId="2" w15:restartNumberingAfterBreak="0">
     <w:nsid w:val="1B2E62A5"/>
     <w:multiLevelType w:val="multilevel"/>
     <w:tmpl w:val="34308D52"/>
@@ -1032,7 +1206,7 @@
       </w:rPr>
     </w:lvl>
   </w:abstractNum>
-  <w:abstractNum w:abstractNumId="3">
+  <w:abstractNum w:abstractNumId="3" w15:restartNumberingAfterBreak="0">
     <w:nsid w:val="2867259A"/>
     <w:multiLevelType w:val="hybridMultilevel"/>
     <w:tmpl w:val="97923C60"/>
@@ -1151,7 +1325,7 @@
       </w:rPr>
     </w:lvl>
   </w:abstractNum>
-  <w:abstractNum w:abstractNumId="4">
+  <w:abstractNum w:abstractNumId="4" w15:restartNumberingAfterBreak="0">
     <w:nsid w:val="2C4458D8"/>
     <w:multiLevelType w:val="hybridMultilevel"/>
     <w:tmpl w:val="B8E4A68C"/>
@@ -1238,7 +1412,7 @@
       </w:pPr>
     </w:lvl>
   </w:abstractNum>
-  <w:abstractNum w:abstractNumId="5">
+  <w:abstractNum w:abstractNumId="5" w15:restartNumberingAfterBreak="0">
     <w:nsid w:val="3A30129C"/>
     <w:multiLevelType w:val="hybridMultilevel"/>
     <w:tmpl w:val="2676E6B6"/>
@@ -1351,7 +1525,7 @@
       </w:rPr>
     </w:lvl>
   </w:abstractNum>
-  <w:abstractNum w:abstractNumId="6">
+  <w:abstractNum w:abstractNumId="6" w15:restartNumberingAfterBreak="0">
     <w:nsid w:val="3C676D85"/>
     <w:multiLevelType w:val="hybridMultilevel"/>
     <w:tmpl w:val="E4AA005A"/>
@@ -1464,7 +1638,7 @@
       </w:rPr>
     </w:lvl>
   </w:abstractNum>
-  <w:abstractNum w:abstractNumId="7">
+  <w:abstractNum w:abstractNumId="7" w15:restartNumberingAfterBreak="0">
     <w:nsid w:val="416D2486"/>
     <w:multiLevelType w:val="hybridMultilevel"/>
     <w:tmpl w:val="D6086D56"/>
@@ -1577,7 +1751,7 @@
       </w:rPr>
     </w:lvl>
   </w:abstractNum>
-  <w:abstractNum w:abstractNumId="8">
+  <w:abstractNum w:abstractNumId="8" w15:restartNumberingAfterBreak="0">
     <w:nsid w:val="541F68A6"/>
     <w:multiLevelType w:val="hybridMultilevel"/>
     <w:tmpl w:val="0A0A8D70"/>
@@ -1696,7 +1870,7 @@
       </w:rPr>
     </w:lvl>
   </w:abstractNum>
-  <w:abstractNum w:abstractNumId="9">
+  <w:abstractNum w:abstractNumId="9" w15:restartNumberingAfterBreak="0">
     <w:nsid w:val="68A97717"/>
     <w:multiLevelType w:val="multilevel"/>
     <w:tmpl w:val="AD2C26CA"/>
@@ -1820,7 +1994,7 @@
       </w:rPr>
     </w:lvl>
   </w:abstractNum>
-  <w:abstractNum w:abstractNumId="10">
+  <w:abstractNum w:abstractNumId="10" w15:restartNumberingAfterBreak="0">
     <w:nsid w:val="69400935"/>
     <w:multiLevelType w:val="multilevel"/>
     <w:tmpl w:val="258A7D1E"/>
@@ -1968,7 +2142,7 @@
       </w:rPr>
     </w:lvl>
   </w:abstractNum>
-  <w:abstractNum w:abstractNumId="11">
+  <w:abstractNum w:abstractNumId="11" w15:restartNumberingAfterBreak="0">
     <w:nsid w:val="6BCF22AA"/>
     <w:multiLevelType w:val="hybridMultilevel"/>
     <w:tmpl w:val="1A220174"/>
@@ -2057,7 +2231,7 @@
       </w:pPr>
     </w:lvl>
   </w:abstractNum>
-  <w:abstractNum w:abstractNumId="12">
+  <w:abstractNum w:abstractNumId="12" w15:restartNumberingAfterBreak="0">
     <w:nsid w:val="7C786116"/>
     <w:multiLevelType w:val="multilevel"/>
     <w:tmpl w:val="17C0655A"/>
@@ -2232,7 +2406,7 @@
 </file>
 
 <file path=word/styles.xml><?xml version="1.0" encoding="utf-8"?>
-<w:styles xmlns:r="http://schemas.openxmlformats.org/officeDocument/2006/relationships" xmlns:w="http://schemas.openxmlformats.org/wordprocessingml/2006/main">
+<w:styles xmlns:mc="http://schemas.openxmlformats.org/markup-compatibility/2006" xmlns:r="http://schemas.openxmlformats.org/officeDocument/2006/relationships" xmlns:w="http://schemas.openxmlformats.org/wordprocessingml/2006/main" xmlns:w14="http://schemas.microsoft.com/office/word/2010/wordml" xmlns:w15="http://schemas.microsoft.com/office/word/2012/wordml" xmlns:w16cex="http://schemas.microsoft.com/office/word/2018/wordml/cex" xmlns:w16cid="http://schemas.microsoft.com/office/word/2016/wordml/cid" xmlns:w16="http://schemas.microsoft.com/office/word/2018/wordml" xmlns:w16sdtdh="http://schemas.microsoft.com/office/word/2020/wordml/sdtdatahash" xmlns:w16se="http://schemas.microsoft.com/office/word/2015/wordml/symex" mc:Ignorable="w14 w15 w16se w16cid w16 w16cex w16sdtdh">
   <w:docDefaults>
     <w:rPrDefault>
       <w:rPr>
@@ -2242,35 +2416,111 @@
     </w:rPrDefault>
     <w:pPrDefault/>
   </w:docDefaults>
-  <w:latentStyles w:defLockedState="0" w:defUIPriority="0" w:defSemiHidden="0" w:defUnhideWhenUsed="0" w:defQFormat="0" w:count="267">
+  <w:latentStyles w:defLockedState="0" w:defUIPriority="0" w:defSemiHidden="0" w:defUnhideWhenUsed="0" w:defQFormat="0" w:count="376">
     <w:lsdException w:name="Normal" w:qFormat="1"/>
     <w:lsdException w:name="heading 1" w:qFormat="1"/>
     <w:lsdException w:name="heading 2" w:semiHidden="1" w:uiPriority="9" w:unhideWhenUsed="1" w:qFormat="1"/>
-    <w:lsdException w:name="heading 3" w:qFormat="1"/>
-    <w:lsdException w:name="heading 4" w:qFormat="1"/>
+    <w:lsdException w:name="heading 3" w:semiHidden="1" w:unhideWhenUsed="1" w:qFormat="1"/>
+    <w:lsdException w:name="heading 4" w:semiHidden="1" w:unhideWhenUsed="1" w:qFormat="1"/>
     <w:lsdException w:name="heading 5" w:semiHidden="1" w:unhideWhenUsed="1" w:qFormat="1"/>
     <w:lsdException w:name="heading 6" w:semiHidden="1" w:unhideWhenUsed="1" w:qFormat="1"/>
     <w:lsdException w:name="heading 7" w:semiHidden="1" w:unhideWhenUsed="1" w:qFormat="1"/>
     <w:lsdException w:name="heading 8" w:semiHidden="1" w:unhideWhenUsed="1" w:qFormat="1"/>
     <w:lsdException w:name="heading 9" w:semiHidden="1" w:unhideWhenUsed="1" w:qFormat="1"/>
-    <w:lsdException w:name="toc 1" w:uiPriority="39"/>
-    <w:lsdException w:name="toc 2" w:uiPriority="39"/>
-    <w:lsdException w:name="annotation text" w:uiPriority="99"/>
-    <w:lsdException w:name="header" w:uiPriority="99"/>
-    <w:lsdException w:name="footer" w:uiPriority="99"/>
+    <w:lsdException w:name="index 1" w:semiHidden="1" w:unhideWhenUsed="1"/>
+    <w:lsdException w:name="index 2" w:semiHidden="1" w:unhideWhenUsed="1"/>
+    <w:lsdException w:name="index 3" w:semiHidden="1" w:unhideWhenUsed="1"/>
+    <w:lsdException w:name="index 4" w:semiHidden="1" w:unhideWhenUsed="1"/>
+    <w:lsdException w:name="index 5" w:semiHidden="1" w:unhideWhenUsed="1"/>
+    <w:lsdException w:name="index 6" w:semiHidden="1" w:unhideWhenUsed="1"/>
+    <w:lsdException w:name="index 7" w:semiHidden="1" w:unhideWhenUsed="1"/>
+    <w:lsdException w:name="index 8" w:semiHidden="1" w:unhideWhenUsed="1"/>
+    <w:lsdException w:name="index 9" w:semiHidden="1" w:unhideWhenUsed="1"/>
+    <w:lsdException w:name="toc 1" w:semiHidden="1" w:uiPriority="39" w:unhideWhenUsed="1"/>
+    <w:lsdException w:name="toc 2" w:semiHidden="1" w:uiPriority="39" w:unhideWhenUsed="1"/>
+    <w:lsdException w:name="toc 3" w:semiHidden="1" w:unhideWhenUsed="1"/>
+    <w:lsdException w:name="toc 4" w:semiHidden="1" w:unhideWhenUsed="1"/>
+    <w:lsdException w:name="toc 5" w:semiHidden="1" w:unhideWhenUsed="1"/>
+    <w:lsdException w:name="toc 6" w:semiHidden="1" w:unhideWhenUsed="1"/>
+    <w:lsdException w:name="toc 7" w:semiHidden="1" w:unhideWhenUsed="1"/>
+    <w:lsdException w:name="toc 8" w:semiHidden="1" w:unhideWhenUsed="1"/>
+    <w:lsdException w:name="toc 9" w:semiHidden="1" w:unhideWhenUsed="1"/>
+    <w:lsdException w:name="Normal Indent" w:semiHidden="1" w:unhideWhenUsed="1"/>
+    <w:lsdException w:name="footnote text" w:semiHidden="1" w:unhideWhenUsed="1"/>
+    <w:lsdException w:name="annotation text" w:semiHidden="1" w:uiPriority="99" w:unhideWhenUsed="1"/>
+    <w:lsdException w:name="header" w:semiHidden="1" w:uiPriority="99" w:unhideWhenUsed="1"/>
+    <w:lsdException w:name="footer" w:semiHidden="1" w:uiPriority="99" w:unhideWhenUsed="1"/>
+    <w:lsdException w:name="index heading" w:semiHidden="1" w:unhideWhenUsed="1"/>
     <w:lsdException w:name="caption" w:semiHidden="1" w:unhideWhenUsed="1" w:qFormat="1"/>
-    <w:lsdException w:name="annotation reference" w:uiPriority="99"/>
+    <w:lsdException w:name="table of figures" w:semiHidden="1" w:unhideWhenUsed="1"/>
+    <w:lsdException w:name="envelope address" w:semiHidden="1" w:unhideWhenUsed="1"/>
+    <w:lsdException w:name="envelope return" w:semiHidden="1" w:unhideWhenUsed="1"/>
+    <w:lsdException w:name="footnote reference" w:semiHidden="1" w:unhideWhenUsed="1"/>
+    <w:lsdException w:name="annotation reference" w:semiHidden="1" w:uiPriority="99" w:unhideWhenUsed="1"/>
+    <w:lsdException w:name="line number" w:semiHidden="1" w:unhideWhenUsed="1"/>
+    <w:lsdException w:name="page number" w:semiHidden="1" w:unhideWhenUsed="1"/>
+    <w:lsdException w:name="endnote reference" w:semiHidden="1" w:unhideWhenUsed="1"/>
+    <w:lsdException w:name="endnote text" w:semiHidden="1" w:unhideWhenUsed="1"/>
+    <w:lsdException w:name="macro" w:semiHidden="1" w:unhideWhenUsed="1"/>
+    <w:lsdException w:name="toa heading" w:semiHidden="1" w:unhideWhenUsed="1"/>
+    <w:lsdException w:name="List Number" w:semiHidden="1" w:unhideWhenUsed="1"/>
+    <w:lsdException w:name="List 2" w:semiHidden="1" w:unhideWhenUsed="1"/>
+    <w:lsdException w:name="List 3" w:semiHidden="1" w:unhideWhenUsed="1"/>
+    <w:lsdException w:name="List 4" w:semiHidden="1" w:unhideWhenUsed="1"/>
+    <w:lsdException w:name="List 5" w:semiHidden="1" w:unhideWhenUsed="1"/>
+    <w:lsdException w:name="List Bullet 2" w:semiHidden="1" w:unhideWhenUsed="1"/>
+    <w:lsdException w:name="List Bullet 3" w:semiHidden="1" w:unhideWhenUsed="1"/>
+    <w:lsdException w:name="List Bullet 4" w:semiHidden="1" w:unhideWhenUsed="1"/>
+    <w:lsdException w:name="List Bullet 5" w:semiHidden="1" w:unhideWhenUsed="1"/>
+    <w:lsdException w:name="List Number 2" w:semiHidden="1" w:unhideWhenUsed="1"/>
+    <w:lsdException w:name="List Number 3" w:semiHidden="1" w:unhideWhenUsed="1"/>
+    <w:lsdException w:name="List Number 4" w:semiHidden="1" w:unhideWhenUsed="1"/>
+    <w:lsdException w:name="List Number 5" w:semiHidden="1" w:unhideWhenUsed="1"/>
     <w:lsdException w:name="Title" w:qFormat="1"/>
-    <w:lsdException w:name="Body Text" w:uiPriority="1" w:qFormat="1"/>
+    <w:lsdException w:name="Closing" w:semiHidden="1" w:unhideWhenUsed="1"/>
+    <w:lsdException w:name="Signature" w:semiHidden="1" w:unhideWhenUsed="1"/>
+    <w:lsdException w:name="Default Paragraph Font" w:semiHidden="1" w:unhideWhenUsed="1"/>
+    <w:lsdException w:name="Body Text" w:semiHidden="1" w:uiPriority="1" w:unhideWhenUsed="1" w:qFormat="1"/>
+    <w:lsdException w:name="Body Text Indent" w:semiHidden="1" w:unhideWhenUsed="1"/>
+    <w:lsdException w:name="List Continue" w:semiHidden="1" w:unhideWhenUsed="1"/>
+    <w:lsdException w:name="Message Header" w:semiHidden="1" w:unhideWhenUsed="1"/>
     <w:lsdException w:name="Subtitle" w:qFormat="1"/>
-    <w:lsdException w:name="Hyperlink" w:uiPriority="99"/>
+    <w:lsdException w:name="Salutation" w:semiHidden="1" w:unhideWhenUsed="1"/>
+    <w:lsdException w:name="Date" w:semiHidden="1" w:unhideWhenUsed="1"/>
+    <w:lsdException w:name="Body Text First Indent" w:semiHidden="1" w:unhideWhenUsed="1"/>
+    <w:lsdException w:name="Body Text First Indent 2" w:semiHidden="1" w:unhideWhenUsed="1"/>
+    <w:lsdException w:name="Note Heading" w:semiHidden="1" w:unhideWhenUsed="1"/>
+    <w:lsdException w:name="Body Text 2" w:semiHidden="1" w:unhideWhenUsed="1"/>
+    <w:lsdException w:name="Body Text 3" w:semiHidden="1" w:unhideWhenUsed="1"/>
+    <w:lsdException w:name="Body Text Indent 2" w:semiHidden="1" w:unhideWhenUsed="1"/>
+    <w:lsdException w:name="Body Text Indent 3" w:semiHidden="1" w:unhideWhenUsed="1"/>
+    <w:lsdException w:name="Block Text" w:semiHidden="1" w:unhideWhenUsed="1"/>
+    <w:lsdException w:name="Hyperlink" w:semiHidden="1" w:uiPriority="99" w:unhideWhenUsed="1"/>
+    <w:lsdException w:name="FollowedHyperlink" w:semiHidden="1" w:unhideWhenUsed="1"/>
     <w:lsdException w:name="Strong" w:qFormat="1"/>
     <w:lsdException w:name="Emphasis" w:qFormat="1"/>
-    <w:lsdException w:name="Normal (Web)" w:uiPriority="99"/>
-    <w:lsdException w:name="HTML Code" w:uiPriority="99"/>
-    <w:lsdException w:name="HTML Preformatted" w:uiPriority="99"/>
+    <w:lsdException w:name="Document Map" w:semiHidden="1" w:unhideWhenUsed="1"/>
+    <w:lsdException w:name="Plain Text" w:semiHidden="1" w:unhideWhenUsed="1"/>
+    <w:lsdException w:name="E-mail Signature" w:semiHidden="1" w:unhideWhenUsed="1"/>
+    <w:lsdException w:name="HTML Top of Form" w:semiHidden="1" w:unhideWhenUsed="1"/>
+    <w:lsdException w:name="HTML Bottom of Form" w:semiHidden="1" w:unhideWhenUsed="1"/>
+    <w:lsdException w:name="Normal (Web)" w:semiHidden="1" w:uiPriority="99" w:unhideWhenUsed="1"/>
+    <w:lsdException w:name="HTML Acronym" w:semiHidden="1" w:unhideWhenUsed="1"/>
+    <w:lsdException w:name="HTML Address" w:semiHidden="1" w:unhideWhenUsed="1"/>
+    <w:lsdException w:name="HTML Cite" w:semiHidden="1" w:unhideWhenUsed="1"/>
+    <w:lsdException w:name="HTML Code" w:semiHidden="1" w:uiPriority="99" w:unhideWhenUsed="1"/>
+    <w:lsdException w:name="HTML Definition" w:semiHidden="1" w:unhideWhenUsed="1"/>
+    <w:lsdException w:name="HTML Keyboard" w:semiHidden="1" w:unhideWhenUsed="1"/>
+    <w:lsdException w:name="HTML Preformatted" w:semiHidden="1" w:uiPriority="99" w:unhideWhenUsed="1"/>
+    <w:lsdException w:name="HTML Sample" w:semiHidden="1" w:unhideWhenUsed="1"/>
+    <w:lsdException w:name="HTML Typewriter" w:semiHidden="1" w:unhideWhenUsed="1"/>
+    <w:lsdException w:name="HTML Variable" w:semiHidden="1" w:unhideWhenUsed="1"/>
     <w:lsdException w:name="Normal Table" w:semiHidden="1" w:unhideWhenUsed="1"/>
-    <w:lsdException w:name="annotation subject" w:uiPriority="99"/>
+    <w:lsdException w:name="annotation subject" w:semiHidden="1" w:uiPriority="99" w:unhideWhenUsed="1"/>
+    <w:lsdException w:name="No List" w:semiHidden="1" w:unhideWhenUsed="1"/>
+    <w:lsdException w:name="Outline List 1" w:semiHidden="1" w:unhideWhenUsed="1"/>
+    <w:lsdException w:name="Outline List 2" w:semiHidden="1" w:unhideWhenUsed="1"/>
+    <w:lsdException w:name="Outline List 3" w:semiHidden="1" w:unhideWhenUsed="1"/>
     <w:lsdException w:name="Table Simple 1" w:semiHidden="1" w:unhideWhenUsed="1"/>
     <w:lsdException w:name="Table Simple 2" w:semiHidden="1" w:unhideWhenUsed="1"/>
     <w:lsdException w:name="Table Simple 3" w:semiHidden="1" w:unhideWhenUsed="1"/>
@@ -2311,10 +2561,7 @@
     <w:lsdException w:name="Table Subtle 1" w:semiHidden="1" w:unhideWhenUsed="1"/>
     <w:lsdException w:name="Table Subtle 2" w:semiHidden="1" w:unhideWhenUsed="1"/>
     <w:lsdException w:name="Table Web 1" w:semiHidden="1" w:unhideWhenUsed="1"/>
-    <w:lsdException w:name="Table Web 2" w:semiHidden="1" w:unhideWhenUsed="1"/>
-    <w:lsdException w:name="Table Web 3" w:semiHidden="1" w:unhideWhenUsed="1"/>
     <w:lsdException w:name="Table Grid" w:uiPriority="39"/>
-    <w:lsdException w:name="Table Theme" w:semiHidden="1" w:unhideWhenUsed="1"/>
     <w:lsdException w:name="Placeholder Text" w:semiHidden="1" w:uiPriority="99"/>
     <w:lsdException w:name="No Spacing" w:uiPriority="1" w:qFormat="1"/>
     <w:lsdException w:name="Light Shading" w:uiPriority="60"/>
@@ -2426,6 +2673,115 @@
     <w:lsdException w:name="Book Title" w:uiPriority="33" w:qFormat="1"/>
     <w:lsdException w:name="Bibliography" w:semiHidden="1" w:uiPriority="37" w:unhideWhenUsed="1"/>
     <w:lsdException w:name="TOC Heading" w:semiHidden="1" w:uiPriority="39" w:unhideWhenUsed="1" w:qFormat="1"/>
+    <w:lsdException w:name="Plain Table 1" w:uiPriority="41"/>
+    <w:lsdException w:name="Plain Table 2" w:uiPriority="42"/>
+    <w:lsdException w:name="Plain Table 3" w:uiPriority="43"/>
+    <w:lsdException w:name="Plain Table 4" w:uiPriority="44"/>
+    <w:lsdException w:name="Plain Table 5" w:uiPriority="45"/>
+    <w:lsdException w:name="Grid Table Light" w:uiPriority="40"/>
+    <w:lsdException w:name="Grid Table 1 Light" w:uiPriority="46"/>
+    <w:lsdException w:name="Grid Table 2" w:uiPriority="47"/>
+    <w:lsdException w:name="Grid Table 3" w:uiPriority="48"/>
+    <w:lsdException w:name="Grid Table 4" w:uiPriority="49"/>
+    <w:lsdException w:name="Grid Table 5 Dark" w:uiPriority="50"/>
+    <w:lsdException w:name="Grid Table 6 Colorful" w:uiPriority="51"/>
+    <w:lsdException w:name="Grid Table 7 Colorful" w:uiPriority="52"/>
+    <w:lsdException w:name="Grid Table 1 Light Accent 1" w:uiPriority="46"/>
+    <w:lsdException w:name="Grid Table 2 Accent 1" w:uiPriority="47"/>
+    <w:lsdException w:name="Grid Table 3 Accent 1" w:uiPriority="48"/>
+    <w:lsdException w:name="Grid Table 4 Accent 1" w:uiPriority="49"/>
+    <w:lsdException w:name="Grid Table 5 Dark Accent 1" w:uiPriority="50"/>
+    <w:lsdException w:name="Grid Table 6 Colorful Accent 1" w:uiPriority="51"/>
+    <w:lsdException w:name="Grid Table 7 Colorful Accent 1" w:uiPriority="52"/>
+    <w:lsdException w:name="Grid Table 1 Light Accent 2" w:uiPriority="46"/>
+    <w:lsdException w:name="Grid Table 2 Accent 2" w:uiPriority="47"/>
+    <w:lsdException w:name="Grid Table 3 Accent 2" w:uiPriority="48"/>
+    <w:lsdException w:name="Grid Table 4 Accent 2" w:uiPriority="49"/>
+    <w:lsdException w:name="Grid Table 5 Dark Accent 2" w:uiPriority="50"/>
+    <w:lsdException w:name="Grid Table 6 Colorful Accent 2" w:uiPriority="51"/>
+    <w:lsdException w:name="Grid Table 7 Colorful Accent 2" w:uiPriority="52"/>
+    <w:lsdException w:name="Grid Table 1 Light Accent 3" w:uiPriority="46"/>
+    <w:lsdException w:name="Grid Table 2 Accent 3" w:uiPriority="47"/>
+    <w:lsdException w:name="Grid Table 3 Accent 3" w:uiPriority="48"/>
+    <w:lsdException w:name="Grid Table 4 Accent 3" w:uiPriority="49"/>
+    <w:lsdException w:name="Grid Table 5 Dark Accent 3" w:uiPriority="50"/>
+    <w:lsdException w:name="Grid Table 6 Colorful Accent 3" w:uiPriority="51"/>
+    <w:lsdException w:name="Grid Table 7 Colorful Accent 3" w:uiPriority="52"/>
+    <w:lsdException w:name="Grid Table 1 Light Accent 4" w:uiPriority="46"/>
+    <w:lsdException w:name="Grid Table 2 Accent 4" w:uiPriority="47"/>
+    <w:lsdException w:name="Grid Table 3 Accent 4" w:uiPriority="48"/>
+    <w:lsdException w:name="Grid Table 4 Accent 4" w:uiPriority="49"/>
+    <w:lsdException w:name="Grid Table 5 Dark Accent 4" w:uiPriority="50"/>
+    <w:lsdException w:name="Grid Table 6 Colorful Accent 4" w:uiPriority="51"/>
+    <w:lsdException w:name="Grid Table 7 Colorful Accent 4" w:uiPriority="52"/>
+    <w:lsdException w:name="Grid Table 1 Light Accent 5" w:uiPriority="46"/>
+    <w:lsdException w:name="Grid Table 2 Accent 5" w:uiPriority="47"/>
+    <w:lsdException w:name="Grid Table 3 Accent 5" w:uiPriority="48"/>
+    <w:lsdException w:name="Grid Table 4 Accent 5" w:uiPriority="49"/>
+    <w:lsdException w:name="Grid Table 5 Dark Accent 5" w:uiPriority="50"/>
+    <w:lsdException w:name="Grid Table 6 Colorful Accent 5" w:uiPriority="51"/>
+    <w:lsdException w:name="Grid Table 7 Colorful Accent 5" w:uiPriority="52"/>
+    <w:lsdException w:name="Grid Table 1 Light Accent 6" w:uiPriority="46"/>
+    <w:lsdException w:name="Grid Table 2 Accent 6" w:uiPriority="47"/>
+    <w:lsdException w:name="Grid Table 3 Accent 6" w:uiPriority="48"/>
+    <w:lsdException w:name="Grid Table 4 Accent 6" w:uiPriority="49"/>
+    <w:lsdException w:name="Grid Table 5 Dark Accent 6" w:uiPriority="50"/>
+    <w:lsdException w:name="Grid Table 6 Colorful Accent 6" w:uiPriority="51"/>
+    <w:lsdException w:name="Grid Table 7 Colorful Accent 6" w:uiPriority="52"/>
+    <w:lsdException w:name="List Table 1 Light" w:uiPriority="46"/>
+    <w:lsdException w:name="List Table 2" w:uiPriority="47"/>
+    <w:lsdException w:name="List Table 3" w:uiPriority="48"/>
+    <w:lsdException w:name="List Table 4" w:uiPriority="49"/>
+    <w:lsdException w:name="List Table 5 Dark" w:uiPriority="50"/>
+    <w:lsdException w:name="List Table 6 Colorful" w:uiPriority="51"/>
+    <w:lsdException w:name="List Table 7 Colorful" w:uiPriority="52"/>
+    <w:lsdException w:name="List Table 1 Light Accent 1" w:uiPriority="46"/>
+    <w:lsdException w:name="List Table 2 Accent 1" w:uiPriority="47"/>
+    <w:lsdException w:name="List Table 3 Accent 1" w:uiPriority="48"/>
+    <w:lsdException w:name="List Table 4 Accent 1" w:uiPriority="49"/>
+    <w:lsdException w:name="List Table 5 Dark Accent 1" w:uiPriority="50"/>
+    <w:lsdException w:name="List Table 6 Colorful Accent 1" w:uiPriority="51"/>
+    <w:lsdException w:name="List Table 7 Colorful Accent 1" w:uiPriority="52"/>
+    <w:lsdException w:name="List Table 1 Light Accent 2" w:uiPriority="46"/>
+    <w:lsdException w:name="List Table 2 Accent 2" w:uiPriority="47"/>
+    <w:lsdException w:name="List Table 3 Accent 2" w:uiPriority="48"/>
+    <w:lsdException w:name="List Table 4 Accent 2" w:uiPriority="49"/>
+    <w:lsdException w:name="List Table 5 Dark Accent 2" w:uiPriority="50"/>
+    <w:lsdException w:name="List Table 6 Colorful Accent 2" w:uiPriority="51"/>
+    <w:lsdException w:name="List Table 7 Colorful Accent 2" w:uiPriority="52"/>
+    <w:lsdException w:name="List Table 1 Light Accent 3" w:uiPriority="46"/>
+    <w:lsdException w:name="List Table 2 Accent 3" w:uiPriority="47"/>
+    <w:lsdException w:name="List Table 3 Accent 3" w:uiPriority="48"/>
+    <w:lsdException w:name="List Table 4 Accent 3" w:uiPriority="49"/>
+    <w:lsdException w:name="List Table 5 Dark Accent 3" w:uiPriority="50"/>
+    <w:lsdException w:name="List Table 6 Colorful Accent 3" w:uiPriority="51"/>
+    <w:lsdException w:name="List Table 7 Colorful Accent 3" w:uiPriority="52"/>
+    <w:lsdException w:name="List Table 1 Light Accent 4" w:uiPriority="46"/>
+    <w:lsdException w:name="List Table 2 Accent 4" w:uiPriority="47"/>
+    <w:lsdException w:name="List Table 3 Accent 4" w:uiPriority="48"/>
+    <w:lsdException w:name="List Table 4 Accent 4" w:uiPriority="49"/>
+    <w:lsdException w:name="List Table 5 Dark Accent 4" w:uiPriority="50"/>
+    <w:lsdException w:name="List Table 6 Colorful Accent 4" w:uiPriority="51"/>
+    <w:lsdException w:name="List Table 7 Colorful Accent 4" w:uiPriority="52"/>
+    <w:lsdException w:name="List Table 1 Light Accent 5" w:uiPriority="46"/>
+    <w:lsdException w:name="List Table 2 Accent 5" w:uiPriority="47"/>
+    <w:lsdException w:name="List Table 3 Accent 5" w:uiPriority="48"/>
+    <w:lsdException w:name="List Table 4 Accent 5" w:uiPriority="49"/>
+    <w:lsdException w:name="List Table 5 Dark Accent 5" w:uiPriority="50"/>
+    <w:lsdException w:name="List Table 6 Colorful Accent 5" w:uiPriority="51"/>
+    <w:lsdException w:name="List Table 7 Colorful Accent 5" w:uiPriority="52"/>
+    <w:lsdException w:name="List Table 1 Light Accent 6" w:uiPriority="46"/>
+    <w:lsdException w:name="List Table 2 Accent 6" w:uiPriority="47"/>
+    <w:lsdException w:name="List Table 3 Accent 6" w:uiPriority="48"/>
+    <w:lsdException w:name="List Table 4 Accent 6" w:uiPriority="49"/>
+    <w:lsdException w:name="List Table 5 Dark Accent 6" w:uiPriority="50"/>
+    <w:lsdException w:name="List Table 6 Colorful Accent 6" w:uiPriority="51"/>
+    <w:lsdException w:name="List Table 7 Colorful Accent 6" w:uiPriority="52"/>
+    <w:lsdException w:name="Mention" w:semiHidden="1" w:uiPriority="99" w:unhideWhenUsed="1"/>
+    <w:lsdException w:name="Smart Hyperlink" w:semiHidden="1" w:uiPriority="99" w:unhideWhenUsed="1"/>
+    <w:lsdException w:name="Hashtag" w:semiHidden="1" w:uiPriority="99" w:unhideWhenUsed="1"/>
+    <w:lsdException w:name="Unresolved Mention" w:semiHidden="1" w:uiPriority="99" w:unhideWhenUsed="1"/>
+    <w:lsdException w:name="Smart Link" w:semiHidden="1" w:uiPriority="99" w:unhideWhenUsed="1"/>
   </w:latentStyles>
   <w:style w:type="paragraph" w:default="1" w:styleId="a1">
     <w:name w:val="Normal"/>
@@ -2659,7 +3015,6 @@
     <w:uiPriority w:val="99"/>
     <w:semiHidden/>
     <w:unhideWhenUsed/>
-    <w:qFormat/>
     <w:tblPr>
       <w:tblInd w:w="0" w:type="dxa"/>
       <w:tblCellMar>
@@ -2703,7 +3058,6 @@
       <w:lang w:eastAsia="en-US"/>
     </w:rPr>
     <w:tblPr>
-      <w:tblInd w:w="0" w:type="dxa"/>
       <w:tblBorders>
         <w:top w:val="single" w:sz="4" w:space="0" w:color="auto"/>
         <w:left w:val="single" w:sz="4" w:space="0" w:color="auto"/>
@@ -2712,12 +3066,6 @@
         <w:insideH w:val="single" w:sz="4" w:space="0" w:color="auto"/>
         <w:insideV w:val="single" w:sz="4" w:space="0" w:color="auto"/>
       </w:tblBorders>
-      <w:tblCellMar>
-        <w:top w:w="0" w:type="dxa"/>
-        <w:left w:w="108" w:type="dxa"/>
-        <w:bottom w:w="0" w:type="dxa"/>
-        <w:right w:w="108" w:type="dxa"/>
-      </w:tblCellMar>
     </w:tblPr>
   </w:style>
   <w:style w:type="character" w:customStyle="1" w:styleId="a7">
@@ -3108,8 +3456,8 @@
       <w:lang w:eastAsia="en-US"/>
     </w:rPr>
   </w:style>
-  <w:style w:type="character" w:customStyle="1" w:styleId="UnresolvedMention">
-    <w:name w:val="Unresolved Mention"/>
+  <w:style w:type="character" w:customStyle="1" w:styleId="13">
+    <w:name w:val="Неразрешенное упоминание1"/>
     <w:basedOn w:val="a2"/>
     <w:uiPriority w:val="99"/>
     <w:semiHidden/>
@@ -3131,7 +3479,7 @@
       <w:ind w:left="278" w:firstLine="0"/>
     </w:pPr>
   </w:style>
-  <w:style w:type="paragraph" w:customStyle="1" w:styleId="13">
+  <w:style w:type="paragraph" w:customStyle="1" w:styleId="14">
     <w:name w:val="Заголовок 1 без уровня"/>
     <w:basedOn w:val="12"/>
     <w:qFormat/>
@@ -3617,7 +3965,7 @@
   <a:extraClrSchemeLst/>
   <a:extLst>
     <a:ext uri="{05A4C25C-085E-4340-85A3-A5531E510DB2}">
-      <thm15:themeFamily xmlns:thm15="http://schemas.microsoft.com/office/thememl/2012/main" xmlns="" name="Office Theme" id="{62F939B6-93AF-4DB8-9C6B-D6C7DFDC589F}" vid="{4A3C46E8-61CC-4603-A589-7422A47A8E4A}"/>
+      <thm15:themeFamily xmlns:thm15="http://schemas.microsoft.com/office/thememl/2012/main" name="Office Theme" id="{62F939B6-93AF-4DB8-9C6B-D6C7DFDC589F}" vid="{4A3C46E8-61CC-4603-A589-7422A47A8E4A}"/>
     </a:ext>
   </a:extLst>
 </a:theme>

</xml_diff>

<commit_message>
A lot of changes
</commit_message>
<xml_diff>
--- a/Отчёты/БД/5Лаб.docx
+++ b/Отчёты/БД/5Лаб.docx
@@ -75,20 +75,7 @@
         <w:rPr>
           <w:szCs w:val="28"/>
         </w:rPr>
-        <w:t xml:space="preserve">ОСНОВЫ РАБОТЫ В СУБД </w:t>
-      </w:r>
-      <w:r>
-        <w:rPr>
-          <w:szCs w:val="28"/>
-          <w:lang w:val="en-US"/>
-        </w:rPr>
-        <w:t>MYSQL</w:t>
-      </w:r>
-      <w:r>
-        <w:rPr>
-          <w:szCs w:val="28"/>
-        </w:rPr>
-        <w:t>. ЗАПРОСЫ</w:t>
+        <w:t>ЗАПРОСЫ ИЗ НЕСКОЛЬКИХ ТАБЛИЦ</w:t>
       </w:r>
     </w:p>
     <w:p>
@@ -169,6 +156,12 @@
           <w:szCs w:val="28"/>
         </w:rPr>
         <w:t>г.  Руководитель старший преподаватель кафедры ЭМИС ______________</w:t>
+      </w:r>
+      <w:r>
+        <w:rPr>
+          <w:szCs w:val="28"/>
+        </w:rPr>
+        <w:t>_____</w:t>
       </w:r>
       <w:r>
         <w:rPr>
@@ -266,7 +259,7 @@
           <w:bCs/>
           <w:szCs w:val="28"/>
         </w:rPr>
-        <w:t>4</w:t>
+        <w:t>5</w:t>
       </w:r>
     </w:p>
     <w:p>
@@ -293,27 +286,12 @@
           <w:b/>
           <w:bCs/>
         </w:rPr>
-        <w:t xml:space="preserve">Основы работы в СУБД </w:t>
+        <w:t>Запросы из нескольких таблиц</w:t>
       </w:r>
       <w:r>
         <w:rPr>
           <w:b/>
           <w:bCs/>
-          <w:lang w:val="en-US"/>
-        </w:rPr>
-        <w:t>MySQL</w:t>
-      </w:r>
-      <w:r>
-        <w:rPr>
-          <w:b/>
-          <w:bCs/>
-        </w:rPr>
-        <w:t>. Запросы</w:t>
-      </w:r>
-      <w:r>
-        <w:rPr>
-          <w:b/>
-          <w:bCs/>
           <w:szCs w:val="28"/>
         </w:rPr>
         <w:t>»</w:t>
@@ -327,24 +305,81 @@
         <w:t xml:space="preserve">Цель работы: </w:t>
       </w:r>
       <w:r>
-        <w:t>получение навыков работы в СУБД MySQL, знакомство с утилитами СУБД MySQL, освоение инструментов и команд создания БД.</w:t>
+        <w:t>получение навыков работы с запросами из нескольких таблиц</w:t>
+      </w:r>
+      <w:r>
+        <w:t>.</w:t>
       </w:r>
     </w:p>
     <w:p>
       <w:pPr>
         <w:pStyle w:val="afd"/>
-        <w:rPr>
-          <w:lang w:val="en-US"/>
-        </w:rPr>
+        <w:keepNext/>
+      </w:pPr>
+      <w:r>
+        <w:rPr>
+          <w:szCs w:val="28"/>
+        </w:rPr>
+        <w:t xml:space="preserve">Первый запрос выводит список преподавателей с атрибутами: ФИО, короткое название кафедры и короткое название факультета. Данные берутся из таблиц </w:t>
+      </w:r>
+      <w:proofErr w:type="spellStart"/>
+      <w:r>
+        <w:rPr>
+          <w:szCs w:val="28"/>
+        </w:rPr>
+        <w:t>Teacher</w:t>
+      </w:r>
+      <w:proofErr w:type="spellEnd"/>
+      <w:r>
+        <w:rPr>
+          <w:szCs w:val="28"/>
+        </w:rPr>
+        <w:t xml:space="preserve">, </w:t>
+      </w:r>
+      <w:proofErr w:type="spellStart"/>
+      <w:r>
+        <w:rPr>
+          <w:szCs w:val="28"/>
+        </w:rPr>
+        <w:t>Cathedra</w:t>
+      </w:r>
+      <w:proofErr w:type="spellEnd"/>
+      <w:r>
+        <w:rPr>
+          <w:szCs w:val="28"/>
+        </w:rPr>
+        <w:t xml:space="preserve"> и </w:t>
+      </w:r>
+      <w:proofErr w:type="spellStart"/>
+      <w:r>
+        <w:rPr>
+          <w:szCs w:val="28"/>
+        </w:rPr>
+        <w:t>Faculty</w:t>
+      </w:r>
+      <w:proofErr w:type="spellEnd"/>
+      <w:r>
+        <w:rPr>
+          <w:szCs w:val="28"/>
+        </w:rPr>
+        <w:t>. Запрос и результат его выполнения представлены на рисунке 1.</w:t>
+      </w:r>
+    </w:p>
+    <w:p>
+      <w:pPr>
+        <w:keepNext/>
+        <w:spacing w:line="240" w:lineRule="auto"/>
+        <w:ind w:firstLine="0"/>
+        <w:jc w:val="center"/>
       </w:pPr>
       <w:r>
         <w:rPr>
           <w:noProof/>
         </w:rPr>
         <w:drawing>
-          <wp:inline distT="0" distB="0" distL="0" distR="0" wp14:anchorId="735E5284" wp14:editId="0490807A">
-            <wp:extent cx="5934710" cy="1380490"/>
-            <wp:effectExtent l="19050" t="0" r="8890" b="0"/>
+          <wp:inline distT="0" distB="0" distL="0" distR="0" wp14:anchorId="0709A4DE" wp14:editId="46D3693B">
+            <wp:extent cx="5284470" cy="1229236"/>
+            <wp:effectExtent l="0" t="0" r="0" b="0"/>
             <wp:docPr id="9" name="Рисунок 1"/>
             <wp:cNvGraphicFramePr>
               <a:graphicFrameLocks xmlns:a="http://schemas.openxmlformats.org/drawingml/2006/main" noChangeAspect="1"/>
@@ -368,7 +403,7 @@
                   <pic:spPr bwMode="auto">
                     <a:xfrm>
                       <a:off x="0" y="0"/>
-                      <a:ext cx="5934710" cy="1380490"/>
+                      <a:ext cx="5300017" cy="1232853"/>
                     </a:xfrm>
                     <a:prstGeom prst="rect">
                       <a:avLst/>
@@ -390,19 +425,43 @@
     </w:p>
     <w:p>
       <w:pPr>
+        <w:pStyle w:val="af8"/>
+        <w:spacing w:line="360" w:lineRule="auto"/>
+      </w:pPr>
+      <w:r>
+        <w:rPr>
+          <w:szCs w:val="28"/>
+        </w:rPr>
+        <w:t>Рисунок 1 – Список преподавателей с кафедрами и факультетами</w:t>
+      </w:r>
+    </w:p>
+    <w:p>
+      <w:pPr>
         <w:pStyle w:val="afd"/>
-        <w:rPr>
-          <w:lang w:val="en-US"/>
-        </w:rPr>
+        <w:keepNext/>
+      </w:pPr>
+      <w:r>
+        <w:rPr>
+          <w:szCs w:val="28"/>
+        </w:rPr>
+        <w:t>Второй запрос выводит количество кафедр на каждом факультете. Запрос и результат его выполнения представлены на рисунке 2.</w:t>
+      </w:r>
+    </w:p>
+    <w:p>
+      <w:pPr>
+        <w:keepNext/>
+        <w:spacing w:line="240" w:lineRule="auto"/>
+        <w:ind w:firstLine="0"/>
+        <w:jc w:val="center"/>
       </w:pPr>
       <w:r>
         <w:rPr>
           <w:noProof/>
         </w:rPr>
         <w:drawing>
-          <wp:inline distT="0" distB="0" distL="0" distR="0" wp14:anchorId="369D78CD" wp14:editId="523017F4">
-            <wp:extent cx="5934710" cy="1656080"/>
-            <wp:effectExtent l="19050" t="0" r="8890" b="0"/>
+          <wp:inline distT="0" distB="0" distL="0" distR="0" wp14:anchorId="4C4C0F8A" wp14:editId="034BEDBF">
+            <wp:extent cx="4796790" cy="1338544"/>
+            <wp:effectExtent l="0" t="0" r="0" b="0"/>
             <wp:docPr id="13" name="Рисунок 2"/>
             <wp:cNvGraphicFramePr>
               <a:graphicFrameLocks xmlns:a="http://schemas.openxmlformats.org/drawingml/2006/main" noChangeAspect="1"/>
@@ -426,7 +485,7 @@
                   <pic:spPr bwMode="auto">
                     <a:xfrm>
                       <a:off x="0" y="0"/>
-                      <a:ext cx="5934710" cy="1656080"/>
+                      <a:ext cx="4821958" cy="1345567"/>
                     </a:xfrm>
                     <a:prstGeom prst="rect">
                       <a:avLst/>
@@ -448,17 +507,47 @@
     </w:p>
     <w:p>
       <w:pPr>
-        <w:pStyle w:val="afd"/>
-        <w:rPr>
-          <w:lang w:val="en-US"/>
-        </w:rPr>
+        <w:pStyle w:val="af8"/>
+        <w:spacing w:line="360" w:lineRule="auto"/>
+        <w:rPr>
+          <w:szCs w:val="28"/>
+        </w:rPr>
+      </w:pPr>
+      <w:r>
+        <w:rPr>
+          <w:szCs w:val="28"/>
+        </w:rPr>
+        <w:t>Рисунок 2 – Количество кафедр на каждом факультете</w:t>
+      </w:r>
+    </w:p>
+    <w:p>
+      <w:pPr>
+        <w:pStyle w:val="af8"/>
+        <w:spacing w:after="0" w:line="360" w:lineRule="auto"/>
+        <w:ind w:firstLine="709"/>
+        <w:jc w:val="both"/>
+        <w:rPr>
+          <w:szCs w:val="28"/>
+        </w:rPr>
+      </w:pPr>
+      <w:r>
+        <w:rPr>
+          <w:szCs w:val="28"/>
+        </w:rPr>
+        <w:t>Третий запрос выводит количество групп на каждом факультете. Запрос и результат его выполнения представлены на рисунке 3.</w:t>
+      </w:r>
+    </w:p>
+    <w:p>
+      <w:pPr>
+        <w:pStyle w:val="af8"/>
+        <w:spacing w:after="0"/>
       </w:pPr>
       <w:r>
         <w:rPr>
           <w:noProof/>
         </w:rPr>
         <w:drawing>
-          <wp:inline distT="0" distB="0" distL="0" distR="0" wp14:anchorId="1A13D06C" wp14:editId="052F7E7A">
+          <wp:inline distT="0" distB="0" distL="0" distR="0" wp14:anchorId="32E1155A" wp14:editId="7FFCE15A">
             <wp:extent cx="5934075" cy="1390650"/>
             <wp:effectExtent l="19050" t="0" r="9525" b="0"/>
             <wp:docPr id="25" name="Рисунок 3"/>
@@ -506,17 +595,48 @@
     </w:p>
     <w:p>
       <w:pPr>
+        <w:pStyle w:val="af8"/>
+        <w:spacing w:line="360" w:lineRule="auto"/>
+      </w:pPr>
+      <w:r>
+        <w:rPr>
+          <w:szCs w:val="28"/>
+        </w:rPr>
+        <w:t>Рисунок 3 – Количество групп на каждом факультете</w:t>
+      </w:r>
+    </w:p>
+    <w:p>
+      <w:pPr>
         <w:pStyle w:val="afd"/>
-        <w:rPr>
-          <w:lang w:val="en-US"/>
-        </w:rPr>
+        <w:keepNext/>
+      </w:pPr>
+      <w:r>
+        <w:rPr>
+          <w:szCs w:val="28"/>
+        </w:rPr>
+        <w:lastRenderedPageBreak/>
+        <w:t>Ч</w:t>
+      </w:r>
+      <w:r>
+        <w:rPr>
+          <w:szCs w:val="28"/>
+        </w:rPr>
+        <w:t>етвёртый запрос выводит количество студентов на каждом факультете. Запрос и результат его выполнения представлены на рисунке 4.</w:t>
+      </w:r>
+    </w:p>
+    <w:p>
+      <w:pPr>
+        <w:keepNext/>
+        <w:spacing w:line="240" w:lineRule="auto"/>
+        <w:ind w:firstLine="0"/>
+        <w:jc w:val="center"/>
       </w:pPr>
       <w:r>
         <w:rPr>
           <w:noProof/>
         </w:rPr>
         <w:drawing>
-          <wp:inline distT="0" distB="0" distL="0" distR="0" wp14:anchorId="0A13CD7D" wp14:editId="34BEEC9B">
+          <wp:inline distT="0" distB="0" distL="0" distR="0" wp14:anchorId="235E3AB9" wp14:editId="70FF9CF3">
             <wp:extent cx="5934710" cy="1405890"/>
             <wp:effectExtent l="19050" t="0" r="8890" b="0"/>
             <wp:docPr id="26" name="Рисунок 4"/>
@@ -564,17 +684,41 @@
     </w:p>
     <w:p>
       <w:pPr>
+        <w:pStyle w:val="af8"/>
+        <w:spacing w:line="360" w:lineRule="auto"/>
+      </w:pPr>
+      <w:r>
+        <w:rPr>
+          <w:szCs w:val="28"/>
+        </w:rPr>
+        <w:t>Рисунок 4 – Количество студентов на каждом факультете</w:t>
+      </w:r>
+    </w:p>
+    <w:p>
+      <w:pPr>
         <w:pStyle w:val="afd"/>
-        <w:rPr>
-          <w:lang w:val="en-US"/>
-        </w:rPr>
+        <w:keepNext/>
+      </w:pPr>
+      <w:r>
+        <w:rPr>
+          <w:szCs w:val="28"/>
+        </w:rPr>
+        <w:t>Пятый запрос выводит список студентов, не сдавших экзамен по дисциплине «IT». Запрос и результат его выполнения представлены на рисунке 5.</w:t>
+      </w:r>
+    </w:p>
+    <w:p>
+      <w:pPr>
+        <w:keepNext/>
+        <w:spacing w:line="240" w:lineRule="auto"/>
+        <w:ind w:firstLine="0"/>
+        <w:jc w:val="center"/>
       </w:pPr>
       <w:r>
         <w:rPr>
           <w:noProof/>
         </w:rPr>
         <w:drawing>
-          <wp:inline distT="0" distB="0" distL="0" distR="0" wp14:anchorId="39FDBFD1" wp14:editId="1F643220">
+          <wp:inline distT="0" distB="0" distL="0" distR="0" wp14:anchorId="19351D00" wp14:editId="25A65342">
             <wp:extent cx="5940425" cy="1473835"/>
             <wp:effectExtent l="0" t="0" r="0" b="0"/>
             <wp:docPr id="1" name="Рисунок 1"/>
@@ -612,18 +756,41 @@
     </w:p>
     <w:p>
       <w:pPr>
+        <w:pStyle w:val="af8"/>
+        <w:spacing w:line="360" w:lineRule="auto"/>
+      </w:pPr>
+      <w:r>
+        <w:rPr>
+          <w:szCs w:val="28"/>
+        </w:rPr>
+        <w:t>Рисунок 5 – Студенты, не сдавшие экзамен по «IT»</w:t>
+      </w:r>
+    </w:p>
+    <w:p>
+      <w:pPr>
         <w:pStyle w:val="afd"/>
-        <w:rPr>
-          <w:lang w:val="en-US"/>
-        </w:rPr>
+        <w:keepNext/>
+      </w:pPr>
+      <w:r>
+        <w:rPr>
+          <w:szCs w:val="28"/>
+        </w:rPr>
+        <w:t>Шестой запрос выводит количество должников по каждой дисциплине. Запрос и результат его выполнения представлены на рисунке 6.</w:t>
+      </w:r>
+    </w:p>
+    <w:p>
+      <w:pPr>
+        <w:keepNext/>
+        <w:spacing w:line="240" w:lineRule="auto"/>
+        <w:ind w:firstLine="0"/>
+        <w:jc w:val="center"/>
       </w:pPr>
       <w:r>
         <w:rPr>
           <w:noProof/>
         </w:rPr>
-        <w:lastRenderedPageBreak/>
         <w:drawing>
-          <wp:inline distT="0" distB="0" distL="0" distR="0" wp14:anchorId="6DB604F1" wp14:editId="29829B8E">
+          <wp:inline distT="0" distB="0" distL="0" distR="0" wp14:anchorId="78D4BEAD" wp14:editId="14A3D96D">
             <wp:extent cx="5940425" cy="850900"/>
             <wp:effectExtent l="0" t="0" r="0" b="0"/>
             <wp:docPr id="2" name="Рисунок 2"/>
@@ -661,20 +828,82 @@
     </w:p>
     <w:p>
       <w:pPr>
+        <w:pStyle w:val="af8"/>
+        <w:spacing w:line="360" w:lineRule="auto"/>
+        <w:rPr>
+          <w:szCs w:val="28"/>
+        </w:rPr>
+      </w:pPr>
+      <w:r>
+        <w:rPr>
+          <w:szCs w:val="28"/>
+        </w:rPr>
+        <w:t>Рисунок 6 – Количество должников по каждой дисциплине</w:t>
+      </w:r>
+    </w:p>
+    <w:p>
+      <w:pPr>
+        <w:pStyle w:val="af8"/>
+        <w:spacing w:after="0" w:line="360" w:lineRule="auto"/>
+        <w:ind w:firstLine="709"/>
+        <w:jc w:val="both"/>
+        <w:rPr>
+          <w:szCs w:val="28"/>
+        </w:rPr>
+      </w:pPr>
+      <w:r>
+        <w:rPr>
+          <w:szCs w:val="28"/>
+        </w:rPr>
+        <w:t>Седьмой запрос выводит количество несданных экзаменов у каждого студента. Запрос и результат его выполнения представлены на рисунке 7.</w:t>
+      </w:r>
+    </w:p>
+    <w:p>
+      <w:pPr>
         <w:pStyle w:val="afd"/>
-        <w:pBdr>
-          <w:bottom w:val="single" w:sz="6" w:space="1" w:color="auto"/>
-        </w:pBdr>
-        <w:rPr>
-          <w:lang w:val="en-US"/>
-        </w:rPr>
+        <w:keepNext/>
+      </w:pPr>
+      <w:r>
+        <w:rPr>
+          <w:szCs w:val="28"/>
+        </w:rPr>
+        <w:t xml:space="preserve">Первый запрос варианта 9 выводит полный список студентов группы 543 со всеми атрибутами из таблицы </w:t>
+      </w:r>
+      <w:proofErr w:type="spellStart"/>
+      <w:r>
+        <w:rPr>
+          <w:szCs w:val="28"/>
+        </w:rPr>
+        <w:t>Student</w:t>
+      </w:r>
+      <w:proofErr w:type="spellEnd"/>
+      <w:r>
+        <w:rPr>
+          <w:szCs w:val="28"/>
+        </w:rPr>
+        <w:t xml:space="preserve"> и полным названием </w:t>
+      </w:r>
+      <w:r>
+        <w:rPr>
+          <w:szCs w:val="28"/>
+        </w:rPr>
+        <w:lastRenderedPageBreak/>
+        <w:t>факультета, на котором обучается каждый студент. Запрос и результат его выполнения представлены на рисунке 8.</w:t>
+      </w:r>
+    </w:p>
+    <w:p>
+      <w:pPr>
+        <w:keepNext/>
+        <w:spacing w:line="240" w:lineRule="auto"/>
+        <w:ind w:firstLine="0"/>
+        <w:jc w:val="center"/>
       </w:pPr>
       <w:r>
         <w:rPr>
           <w:noProof/>
         </w:rPr>
         <w:drawing>
-          <wp:inline distT="0" distB="0" distL="0" distR="0" wp14:anchorId="6147B611" wp14:editId="7CCCE9C6">
+          <wp:inline distT="0" distB="0" distL="0" distR="0" wp14:anchorId="6CD8F7B2" wp14:editId="41A315CF">
             <wp:extent cx="5940425" cy="1328420"/>
             <wp:effectExtent l="0" t="0" r="0" b="0"/>
             <wp:docPr id="3" name="Рисунок 3"/>
@@ -712,17 +941,29 @@
     </w:p>
     <w:p>
       <w:pPr>
-        <w:pStyle w:val="afd"/>
-        <w:rPr>
-          <w:lang w:val="en-US"/>
-        </w:rPr>
+        <w:pStyle w:val="af8"/>
+        <w:spacing w:line="360" w:lineRule="auto"/>
+      </w:pPr>
+      <w:r>
+        <w:rPr>
+          <w:szCs w:val="28"/>
+        </w:rPr>
+        <w:t>Рисунок 7 – Количество несданных экзаменов у каждого студента</w:t>
+      </w:r>
+    </w:p>
+    <w:p>
+      <w:pPr>
+        <w:keepNext/>
+        <w:spacing w:line="240" w:lineRule="auto"/>
+        <w:ind w:firstLine="0"/>
+        <w:jc w:val="center"/>
       </w:pPr>
       <w:r>
         <w:rPr>
           <w:noProof/>
         </w:rPr>
         <w:drawing>
-          <wp:inline distT="0" distB="0" distL="0" distR="0" wp14:anchorId="7F192E1F" wp14:editId="442A804C">
+          <wp:inline distT="0" distB="0" distL="0" distR="0" wp14:anchorId="494D6766" wp14:editId="39848F51">
             <wp:extent cx="5940425" cy="1527810"/>
             <wp:effectExtent l="0" t="0" r="0" b="0"/>
             <wp:docPr id="4" name="Рисунок 4"/>
@@ -760,18 +1001,42 @@
     </w:p>
     <w:p>
       <w:pPr>
+        <w:pStyle w:val="af8"/>
+        <w:spacing w:line="360" w:lineRule="auto"/>
+      </w:pPr>
+      <w:r>
+        <w:rPr>
+          <w:szCs w:val="28"/>
+        </w:rPr>
+        <w:t>Рисунок 8 – Список студентов с полным названием факультета</w:t>
+      </w:r>
+    </w:p>
+    <w:p>
+      <w:pPr>
         <w:pStyle w:val="afd"/>
-        <w:rPr>
-          <w:lang w:val="en-US"/>
-        </w:rPr>
+        <w:keepNext/>
+      </w:pPr>
+      <w:r>
+        <w:rPr>
+          <w:szCs w:val="28"/>
+        </w:rPr>
+        <w:t>Второй запрос варианта 9 выводит список групп с коротким названием факультета, к которому они относятся. Запрос и результат его выполнения представлены на рисунке 9.</w:t>
+      </w:r>
+    </w:p>
+    <w:p>
+      <w:pPr>
+        <w:keepNext/>
+        <w:spacing w:line="240" w:lineRule="auto"/>
+        <w:ind w:firstLine="0"/>
+        <w:jc w:val="center"/>
       </w:pPr>
       <w:r>
         <w:rPr>
           <w:noProof/>
         </w:rPr>
         <w:drawing>
-          <wp:inline distT="0" distB="0" distL="0" distR="0" wp14:anchorId="32E9B372" wp14:editId="59919636">
-            <wp:extent cx="5940425" cy="1311910"/>
+          <wp:inline distT="0" distB="0" distL="0" distR="0" wp14:anchorId="2D7AF968" wp14:editId="0DC60CD2">
+            <wp:extent cx="4635041" cy="956310"/>
             <wp:effectExtent l="0" t="0" r="0" b="0"/>
             <wp:docPr id="6" name="Рисунок 6"/>
             <wp:cNvGraphicFramePr>
@@ -793,7 +1058,7 @@
                   <pic:spPr>
                     <a:xfrm>
                       <a:off x="0" y="0"/>
-                      <a:ext cx="5940425" cy="1311910"/>
+                      <a:ext cx="4640449" cy="957426"/>
                     </a:xfrm>
                     <a:prstGeom prst="rect">
                       <a:avLst/>
@@ -806,8 +1071,253 @@
         </w:drawing>
       </w:r>
     </w:p>
+    <w:p>
+      <w:pPr>
+        <w:pStyle w:val="af8"/>
+        <w:spacing w:line="360" w:lineRule="auto"/>
+        <w:rPr>
+          <w:szCs w:val="28"/>
+        </w:rPr>
+      </w:pPr>
+      <w:r>
+        <w:rPr>
+          <w:szCs w:val="28"/>
+        </w:rPr>
+        <w:t>Рисунок 9 – Список групп с короткими названиями факультетов</w:t>
+      </w:r>
+    </w:p>
+    <w:p>
+      <w:pPr>
+        <w:pStyle w:val="af8"/>
+        <w:spacing w:line="360" w:lineRule="auto"/>
+        <w:ind w:firstLine="709"/>
+        <w:jc w:val="both"/>
+      </w:pPr>
+      <w:r>
+        <w:rPr>
+          <w:szCs w:val="28"/>
+        </w:rPr>
+        <w:t>Третий запрос варианта 9 выводит количество студентов в каждой группе, которая относится к факультету «FVS». Запрос и результат его выполнения представлены на рисунке 10.</w:t>
+      </w:r>
+    </w:p>
+    <w:p>
+      <w:pPr>
+        <w:keepNext/>
+        <w:spacing w:line="240" w:lineRule="auto"/>
+        <w:ind w:firstLine="0"/>
+        <w:jc w:val="center"/>
+      </w:pPr>
+      <w:r>
+        <w:rPr>
+          <w:noProof/>
+        </w:rPr>
+        <w:drawing>
+          <wp:inline distT="0" distB="0" distL="0" distR="0" wp14:anchorId="7307DCEC" wp14:editId="6A3EC007">
+            <wp:extent cx="4639310" cy="906773"/>
+            <wp:effectExtent l="0" t="0" r="0" b="0"/>
+            <wp:docPr id="7" name="Рисунок 7"/>
+            <wp:cNvGraphicFramePr>
+              <a:graphicFrameLocks xmlns:a="http://schemas.openxmlformats.org/drawingml/2006/main" noChangeAspect="1"/>
+            </wp:cNvGraphicFramePr>
+            <a:graphic xmlns:a="http://schemas.openxmlformats.org/drawingml/2006/main">
+              <a:graphicData uri="http://schemas.openxmlformats.org/drawingml/2006/picture">
+                <pic:pic xmlns:pic="http://schemas.openxmlformats.org/drawingml/2006/picture">
+                  <pic:nvPicPr>
+                    <pic:cNvPr id="1" name=""/>
+                    <pic:cNvPicPr/>
+                  </pic:nvPicPr>
+                  <pic:blipFill>
+                    <a:blip r:embed="rId17"/>
+                    <a:stretch>
+                      <a:fillRect/>
+                    </a:stretch>
+                  </pic:blipFill>
+                  <pic:spPr>
+                    <a:xfrm>
+                      <a:off x="0" y="0"/>
+                      <a:ext cx="4707885" cy="920176"/>
+                    </a:xfrm>
+                    <a:prstGeom prst="rect">
+                      <a:avLst/>
+                    </a:prstGeom>
+                  </pic:spPr>
+                </pic:pic>
+              </a:graphicData>
+            </a:graphic>
+          </wp:inline>
+        </w:drawing>
+      </w:r>
+    </w:p>
+    <w:p>
+      <w:pPr>
+        <w:pStyle w:val="af8"/>
+        <w:spacing w:line="360" w:lineRule="auto"/>
+      </w:pPr>
+      <w:r>
+        <w:rPr>
+          <w:szCs w:val="28"/>
+        </w:rPr>
+        <w:t>Рисунок 10 – Количество студентов в группах факультета «FVS»</w:t>
+      </w:r>
+    </w:p>
+    <w:p>
+      <w:pPr>
+        <w:pStyle w:val="afd"/>
+        <w:keepNext/>
+      </w:pPr>
+      <w:r>
+        <w:rPr>
+          <w:szCs w:val="28"/>
+        </w:rPr>
+        <w:lastRenderedPageBreak/>
+        <w:t>Четвёртый запрос варианта 9 выводит общий список студентов и преподавателей всех кафедр (ФИО, Кафедра). Запрос и результат его выполнения представлены на рисунке 11.</w:t>
+      </w:r>
+    </w:p>
+    <w:p>
+      <w:pPr>
+        <w:keepNext/>
+        <w:spacing w:line="240" w:lineRule="auto"/>
+        <w:ind w:firstLine="0"/>
+        <w:jc w:val="center"/>
+      </w:pPr>
+      <w:r>
+        <w:rPr>
+          <w:noProof/>
+        </w:rPr>
+        <w:drawing>
+          <wp:inline distT="0" distB="0" distL="0" distR="0" wp14:anchorId="6B847561" wp14:editId="5397F649">
+            <wp:extent cx="5940425" cy="2417445"/>
+            <wp:effectExtent l="0" t="0" r="0" b="0"/>
+            <wp:docPr id="8" name="Рисунок 8"/>
+            <wp:cNvGraphicFramePr>
+              <a:graphicFrameLocks xmlns:a="http://schemas.openxmlformats.org/drawingml/2006/main" noChangeAspect="1"/>
+            </wp:cNvGraphicFramePr>
+            <a:graphic xmlns:a="http://schemas.openxmlformats.org/drawingml/2006/main">
+              <a:graphicData uri="http://schemas.openxmlformats.org/drawingml/2006/picture">
+                <pic:pic xmlns:pic="http://schemas.openxmlformats.org/drawingml/2006/picture">
+                  <pic:nvPicPr>
+                    <pic:cNvPr id="1" name=""/>
+                    <pic:cNvPicPr/>
+                  </pic:nvPicPr>
+                  <pic:blipFill>
+                    <a:blip r:embed="rId18"/>
+                    <a:stretch>
+                      <a:fillRect/>
+                    </a:stretch>
+                  </pic:blipFill>
+                  <pic:spPr>
+                    <a:xfrm>
+                      <a:off x="0" y="0"/>
+                      <a:ext cx="5940425" cy="2417445"/>
+                    </a:xfrm>
+                    <a:prstGeom prst="rect">
+                      <a:avLst/>
+                    </a:prstGeom>
+                  </pic:spPr>
+                </pic:pic>
+              </a:graphicData>
+            </a:graphic>
+          </wp:inline>
+        </w:drawing>
+      </w:r>
+    </w:p>
+    <w:p>
+      <w:pPr>
+        <w:pStyle w:val="af8"/>
+        <w:spacing w:line="360" w:lineRule="auto"/>
+      </w:pPr>
+      <w:r>
+        <w:rPr>
+          <w:szCs w:val="28"/>
+        </w:rPr>
+        <w:t>Рисунок 11 – Общий список студентов и преподавателей всех кафедр</w:t>
+      </w:r>
+    </w:p>
+    <w:p>
+      <w:pPr>
+        <w:pStyle w:val="afd"/>
+        <w:keepNext/>
+      </w:pPr>
+      <w:r>
+        <w:rPr>
+          <w:szCs w:val="28"/>
+        </w:rPr>
+        <w:t>Пятый запрос варианта 9 выводит список студентов с оценками 5 по предмету «IT» (Информационные технологии) (ФИО, Название предмета, Оценка). Запрос и результат его выполнения представлены на рисунке 12.</w:t>
+      </w:r>
+    </w:p>
+    <w:p>
+      <w:pPr>
+        <w:keepNext/>
+        <w:spacing w:line="240" w:lineRule="auto"/>
+        <w:ind w:firstLine="0"/>
+        <w:jc w:val="center"/>
+      </w:pPr>
+      <w:r>
+        <w:rPr>
+          <w:noProof/>
+        </w:rPr>
+        <w:drawing>
+          <wp:inline distT="0" distB="0" distL="0" distR="0" wp14:anchorId="07D025AA" wp14:editId="5741A7C0">
+            <wp:extent cx="5940425" cy="989330"/>
+            <wp:effectExtent l="0" t="0" r="0" b="0"/>
+            <wp:docPr id="10" name="Рисунок 10"/>
+            <wp:cNvGraphicFramePr>
+              <a:graphicFrameLocks xmlns:a="http://schemas.openxmlformats.org/drawingml/2006/main" noChangeAspect="1"/>
+            </wp:cNvGraphicFramePr>
+            <a:graphic xmlns:a="http://schemas.openxmlformats.org/drawingml/2006/main">
+              <a:graphicData uri="http://schemas.openxmlformats.org/drawingml/2006/picture">
+                <pic:pic xmlns:pic="http://schemas.openxmlformats.org/drawingml/2006/picture">
+                  <pic:nvPicPr>
+                    <pic:cNvPr id="1" name=""/>
+                    <pic:cNvPicPr/>
+                  </pic:nvPicPr>
+                  <pic:blipFill>
+                    <a:blip r:embed="rId19"/>
+                    <a:stretch>
+                      <a:fillRect/>
+                    </a:stretch>
+                  </pic:blipFill>
+                  <pic:spPr>
+                    <a:xfrm>
+                      <a:off x="0" y="0"/>
+                      <a:ext cx="5940425" cy="989330"/>
+                    </a:xfrm>
+                    <a:prstGeom prst="rect">
+                      <a:avLst/>
+                    </a:prstGeom>
+                  </pic:spPr>
+                </pic:pic>
+              </a:graphicData>
+            </a:graphic>
+          </wp:inline>
+        </w:drawing>
+      </w:r>
+    </w:p>
+    <w:p>
+      <w:pPr>
+        <w:pStyle w:val="af8"/>
+        <w:spacing w:line="360" w:lineRule="auto"/>
+        <w:rPr>
+          <w:szCs w:val="28"/>
+        </w:rPr>
+      </w:pPr>
+      <w:r>
+        <w:rPr>
+          <w:szCs w:val="28"/>
+        </w:rPr>
+        <w:t>Рисунок 12 – Студенты с оценкой 5 по предмету «IT»</w:t>
+      </w:r>
+    </w:p>
+    <w:p>
+      <w:pPr>
+        <w:pStyle w:val="afd"/>
+      </w:pPr>
+      <w:r>
+        <w:t>Вывод: получен навык работы с запросами из нескольких таблиц.</w:t>
+      </w:r>
+    </w:p>
     <w:sectPr>
-      <w:footerReference w:type="default" r:id="rId17"/>
+      <w:footerReference w:type="default" r:id="rId20"/>
       <w:pgSz w:w="11906" w:h="16838"/>
       <w:pgMar w:top="1134" w:right="850" w:bottom="1134" w:left="1701" w:header="708" w:footer="708" w:gutter="0"/>
       <w:cols w:space="708"/>
@@ -2561,7 +3071,10 @@
     <w:lsdException w:name="Table Subtle 1" w:semiHidden="1" w:unhideWhenUsed="1"/>
     <w:lsdException w:name="Table Subtle 2" w:semiHidden="1" w:unhideWhenUsed="1"/>
     <w:lsdException w:name="Table Web 1" w:semiHidden="1" w:unhideWhenUsed="1"/>
+    <w:lsdException w:name="Table Web 2" w:semiHidden="1" w:unhideWhenUsed="1"/>
+    <w:lsdException w:name="Table Web 3" w:semiHidden="1" w:unhideWhenUsed="1"/>
     <w:lsdException w:name="Table Grid" w:uiPriority="39"/>
+    <w:lsdException w:name="Table Theme" w:semiHidden="1" w:unhideWhenUsed="1"/>
     <w:lsdException w:name="Placeholder Text" w:semiHidden="1" w:uiPriority="99"/>
     <w:lsdException w:name="No Spacing" w:uiPriority="1" w:qFormat="1"/>
     <w:lsdException w:name="Light Shading" w:uiPriority="60"/>

</xml_diff>